<commit_message>
updating cloudbuild yaml file
</commit_message>
<xml_diff>
--- a/forecast_project/Development to Deployment.docx
+++ b/forecast_project/Development to Deployment.docx
@@ -21,13 +21,6 @@
         </w:rPr>
         <w:t xml:space="preserve"> 1</w:t>
       </w:r>
-    </w:p>
-    <w:p>
-      <w:pPr>
-        <w:rPr>
-          <w:lang w:val="en-US"/>
-        </w:rPr>
-      </w:pPr>
     </w:p>
     <w:p>
       <w:pPr>
@@ -95,14 +88,7 @@
           <w:rFonts w:cstheme="minorHAnsi"/>
           <w:lang w:val="en-US"/>
         </w:rPr>
-        <w:t xml:space="preserve">Replace input and output file from locally to GCP </w:t>
-      </w:r>
-      <w:r>
-        <w:rPr>
-          <w:rFonts w:cstheme="minorHAnsi"/>
-          <w:lang w:val="en-US"/>
-        </w:rPr>
-        <w:t>and confirm its successful execution</w:t>
+        <w:t>Replace input and output file from locally to GCP and confirm its successful execution</w:t>
       </w:r>
     </w:p>
     <w:p>
@@ -256,14 +242,7 @@
           <w:rFonts w:cstheme="minorHAnsi"/>
           <w:lang w:val="en-US"/>
         </w:rPr>
-        <w:t xml:space="preserve">Unzip your folder- </w:t>
-      </w:r>
-      <w:r>
-        <w:rPr>
-          <w:rFonts w:cstheme="minorHAnsi"/>
-          <w:lang w:val="en-US"/>
-        </w:rPr>
-        <w:t>unzip forecast_project.zip</w:t>
+        <w:t>Unzip your folder- unzip forecast_project.zip</w:t>
       </w:r>
     </w:p>
     <w:p>
@@ -283,14 +262,7 @@
           <w:rFonts w:cstheme="minorHAnsi"/>
           <w:lang w:val="en-US"/>
         </w:rPr>
-        <w:t xml:space="preserve">Go inside the project folder - </w:t>
-      </w:r>
-      <w:r>
-        <w:rPr>
-          <w:rFonts w:cstheme="minorHAnsi"/>
-          <w:lang w:val="en-US"/>
-        </w:rPr>
-        <w:t>cd forecast_project</w:t>
+        <w:t>Go inside the project folder - cd forecast_project</w:t>
       </w:r>
     </w:p>
     <w:p>
@@ -330,14 +302,7 @@
           <w:rFonts w:cstheme="minorHAnsi"/>
           <w:lang w:val="en-US"/>
         </w:rPr>
-        <w:t xml:space="preserve">Go to Search – Artifact Registry – Create Registry – and name It - </w:t>
-      </w:r>
-      <w:r>
-        <w:rPr>
-          <w:rFonts w:cstheme="minorHAnsi"/>
-          <w:lang w:val="en-US"/>
-        </w:rPr>
-        <w:t>forecast-repo</w:t>
+        <w:t>Go to Search – Artifact Registry – Create Registry – and name It - forecast-repo</w:t>
       </w:r>
     </w:p>
     <w:p>
@@ -479,21 +444,7 @@
           <w:rFonts w:cstheme="minorHAnsi"/>
           <w:lang w:val="en-US"/>
         </w:rPr>
-        <w:t>Create Cloud Run Job</w:t>
-      </w:r>
-      <w:r>
-        <w:rPr>
-          <w:rFonts w:cstheme="minorHAnsi"/>
-          <w:lang w:val="en-US"/>
-        </w:rPr>
-        <w:t xml:space="preserve"> - </w:t>
-      </w:r>
-      <w:r>
-        <w:rPr>
-          <w:rFonts w:cstheme="minorHAnsi"/>
-          <w:lang w:val="en-US"/>
-        </w:rPr>
-        <w:t>Cloud Run → Jobs → Create Job</w:t>
+        <w:t>Create Cloud Run Job - Cloud Run → Jobs → Create Job</w:t>
       </w:r>
     </w:p>
     <w:p>
@@ -702,25 +653,25 @@
           <w:sz w:val="22"/>
           <w:szCs w:val="22"/>
         </w:rPr>
+        <w:t>When you run this inside Cloud Shell:</w:t>
+      </w:r>
+    </w:p>
+    <w:p>
+      <w:pPr>
+        <w:pStyle w:val="Heading3"/>
+        <w:rPr>
+          <w:rFonts w:asciiTheme="minorHAnsi" w:hAnsiTheme="minorHAnsi" w:cstheme="minorHAnsi"/>
+          <w:sz w:val="22"/>
+          <w:szCs w:val="22"/>
+        </w:rPr>
+      </w:pPr>
+      <w:r>
+        <w:rPr>
+          <w:rFonts w:ascii="Segoe UI Emoji" w:hAnsi="Segoe UI Emoji" w:cs="Segoe UI Emoji"/>
+          <w:sz w:val="22"/>
+          <w:szCs w:val="22"/>
+        </w:rPr>
         <w:lastRenderedPageBreak/>
-        <w:t>When you run this inside Cloud Shell:</w:t>
-      </w:r>
-    </w:p>
-    <w:p>
-      <w:pPr>
-        <w:pStyle w:val="Heading3"/>
-        <w:rPr>
-          <w:rFonts w:asciiTheme="minorHAnsi" w:hAnsiTheme="minorHAnsi" w:cstheme="minorHAnsi"/>
-          <w:sz w:val="22"/>
-          <w:szCs w:val="22"/>
-        </w:rPr>
-      </w:pPr>
-      <w:r>
-        <w:rPr>
-          <w:rFonts w:ascii="Segoe UI Emoji" w:hAnsi="Segoe UI Emoji" w:cs="Segoe UI Emoji"/>
-          <w:sz w:val="22"/>
-          <w:szCs w:val="22"/>
-        </w:rPr>
         <w:t>✅</w:t>
       </w:r>
       <w:r>
@@ -1489,27 +1440,27 @@
           <w:sz w:val="22"/>
           <w:szCs w:val="22"/>
         </w:rPr>
+        <w:t>So Artifact Registry now stores:</w:t>
+      </w:r>
+    </w:p>
+    <w:p>
+      <w:pPr>
+        <w:pStyle w:val="HTMLPreformatted"/>
+        <w:rPr>
+          <w:rStyle w:val="HTMLCode"/>
+          <w:rFonts w:asciiTheme="minorHAnsi" w:hAnsiTheme="minorHAnsi" w:cstheme="minorHAnsi"/>
+          <w:sz w:val="22"/>
+          <w:szCs w:val="22"/>
+        </w:rPr>
+      </w:pPr>
+      <w:r>
+        <w:rPr>
+          <w:rStyle w:val="HTMLCode"/>
+          <w:rFonts w:asciiTheme="minorHAnsi" w:hAnsiTheme="minorHAnsi" w:cstheme="minorHAnsi"/>
+          <w:sz w:val="22"/>
+          <w:szCs w:val="22"/>
+        </w:rPr>
         <w:lastRenderedPageBreak/>
-        <w:t>So Artifact Registry now stores:</w:t>
-      </w:r>
-    </w:p>
-    <w:p>
-      <w:pPr>
-        <w:pStyle w:val="HTMLPreformatted"/>
-        <w:rPr>
-          <w:rStyle w:val="HTMLCode"/>
-          <w:rFonts w:asciiTheme="minorHAnsi" w:hAnsiTheme="minorHAnsi" w:cstheme="minorHAnsi"/>
-          <w:sz w:val="22"/>
-          <w:szCs w:val="22"/>
-        </w:rPr>
-      </w:pPr>
-      <w:r>
-        <w:rPr>
-          <w:rStyle w:val="HTMLCode"/>
-          <w:rFonts w:asciiTheme="minorHAnsi" w:hAnsiTheme="minorHAnsi" w:cstheme="minorHAnsi"/>
-          <w:sz w:val="22"/>
-          <w:szCs w:val="22"/>
-        </w:rPr>
         <w:t>forecast-app:latest</w:t>
       </w:r>
     </w:p>
@@ -3018,15 +2969,7 @@
           <w:szCs w:val="22"/>
         </w:rPr>
         <w:br/>
-        <w:t>No memory carried forward</w:t>
-      </w:r>
-      <w:r>
-        <w:rPr>
-          <w:rFonts w:asciiTheme="minorHAnsi" w:hAnsiTheme="minorHAnsi" w:cstheme="minorHAnsi"/>
-          <w:sz w:val="22"/>
-          <w:szCs w:val="22"/>
-        </w:rPr>
-        <w:t>.</w:t>
+        <w:t>No memory carried forward.</w:t>
       </w:r>
     </w:p>
     <w:p>
@@ -3046,16 +2989,7 @@
           <w:szCs w:val="22"/>
           <w:lang w:val="en-US"/>
         </w:rPr>
-        <w:t xml:space="preserve">Option </w:t>
-      </w:r>
-      <w:r>
-        <w:rPr>
-          <w:rFonts w:asciiTheme="minorHAnsi" w:hAnsiTheme="minorHAnsi" w:cstheme="minorHAnsi"/>
-          <w:sz w:val="22"/>
-          <w:szCs w:val="22"/>
-          <w:lang w:val="en-US"/>
-        </w:rPr>
-        <w:t>2</w:t>
+        <w:t>Option 2</w:t>
       </w:r>
     </w:p>
     <w:p>
@@ -5355,19 +5289,7 @@
         <w:rPr>
           <w:lang w:val="en-US"/>
         </w:rPr>
-        <w:t xml:space="preserve"> can see 2 docker file now, one with </w:t>
-      </w:r>
-      <w:r>
-        <w:rPr>
-          <w:lang w:val="en-US"/>
-        </w:rPr>
-        <w:t>forecast</w:t>
-      </w:r>
-      <w:r>
-        <w:rPr>
-          <w:lang w:val="en-US"/>
-        </w:rPr>
-        <w:t xml:space="preserve"> app and other with complete name that we push to artifact. Also Can</w:t>
+        <w:t xml:space="preserve"> can see 2 docker file now, one with forecast app and other with complete name that we push to artifact. Also Can</w:t>
       </w:r>
       <w:r>
         <w:rPr>
@@ -7630,10 +7552,1685 @@
         </w:rPr>
         <w:t>3</w:t>
       </w:r>
-    </w:p>
-    <w:p>
-      <w:pPr>
-        <w:spacing w:line="240" w:lineRule="auto"/>
+      <w:r>
+        <w:rPr>
+          <w:rFonts w:asciiTheme="minorHAnsi" w:hAnsiTheme="minorHAnsi" w:cstheme="minorHAnsi"/>
+          <w:sz w:val="22"/>
+          <w:szCs w:val="22"/>
+          <w:lang w:val="en-US"/>
+        </w:rPr>
+        <w:t xml:space="preserve"> (CI-CD Pipeline)</w:t>
+      </w:r>
+    </w:p>
+    <w:p>
+      <w:pPr>
+        <w:rPr>
+          <w:lang w:val="en-US"/>
+        </w:rPr>
+      </w:pPr>
+      <w:r>
+        <w:rPr>
+          <w:lang w:val="en-US"/>
+        </w:rPr>
+        <w:t xml:space="preserve">Vs code </w:t>
+      </w:r>
+      <w:r>
+        <w:rPr>
+          <w:lang w:val="en-US"/>
+        </w:rPr>
+        <w:sym w:font="Wingdings" w:char="F0E0"/>
+      </w:r>
+      <w:r>
+        <w:rPr>
+          <w:lang w:val="en-US"/>
+        </w:rPr>
+        <w:t xml:space="preserve"> GitHub </w:t>
+      </w:r>
+      <w:r>
+        <w:rPr>
+          <w:lang w:val="en-US"/>
+        </w:rPr>
+        <w:sym w:font="Wingdings" w:char="F0E0"/>
+      </w:r>
+      <w:r>
+        <w:rPr>
+          <w:lang w:val="en-US"/>
+        </w:rPr>
+        <w:t xml:space="preserve"> GCP</w:t>
+      </w:r>
+    </w:p>
+    <w:p>
+      <w:pPr>
+        <w:pStyle w:val="NormalWeb"/>
+      </w:pPr>
+      <w:r>
+        <w:t xml:space="preserve">That’s a very good idea </w:t>
+      </w:r>
+      <w:r>
+        <w:rPr>
+          <w:rFonts w:ascii="Segoe UI Emoji" w:hAnsi="Segoe UI Emoji" w:cs="Segoe UI Emoji"/>
+        </w:rPr>
+        <w:t>👏</w:t>
+      </w:r>
+      <w:r>
+        <w:br/>
+        <w:t xml:space="preserve">Let’s write the </w:t>
+      </w:r>
+      <w:r>
+        <w:rPr>
+          <w:rStyle w:val="Strong"/>
+          <w:rFonts w:eastAsiaTheme="majorEastAsia"/>
+        </w:rPr>
+        <w:t>complete end-to-end workflow</w:t>
+      </w:r>
+      <w:r>
+        <w:t xml:space="preserve"> cleanly and professionally so you can save it.</w:t>
+      </w:r>
+    </w:p>
+    <w:p>
+      <w:pPr>
+        <w:pStyle w:val="NormalWeb"/>
+      </w:pPr>
+      <w:r>
+        <w:t>This is the full CI/CD pipeline:</w:t>
+      </w:r>
+    </w:p>
+    <w:p>
+      <w:pPr>
+        <w:pStyle w:val="NormalWeb"/>
+      </w:pPr>
+      <w:r>
+        <w:t>VS Code → GitHub → Cloud Build → Artifact Registry → Cloud Run Job → Scheduler</w:t>
+      </w:r>
+    </w:p>
+    <w:p>
+      <w:pPr>
+        <w:pStyle w:val="NormalWeb"/>
+      </w:pPr>
+      <w:r>
+        <w:t>No steps skipped.</w:t>
+      </w:r>
+    </w:p>
+    <w:p>
+      <w:r>
+        <w:pict w14:anchorId="23AD2D97">
+          <v:rect id="_x0000_i1073" style="width:0;height:1.5pt" o:hralign="center" o:hrstd="t" o:hr="t" fillcolor="#a0a0a0" stroked="f"/>
+        </w:pict>
+      </w:r>
+    </w:p>
+    <w:p>
+      <w:pPr>
+        <w:pStyle w:val="Heading2"/>
+      </w:pPr>
+      <w:r>
+        <w:rPr>
+          <w:rFonts w:ascii="Segoe UI Emoji" w:hAnsi="Segoe UI Emoji" w:cs="Segoe UI Emoji"/>
+        </w:rPr>
+        <w:t>🔵</w:t>
+      </w:r>
+      <w:r>
+        <w:t xml:space="preserve"> PART 1 — Setup Git &amp; Connect VS Code to GitHub</w:t>
+      </w:r>
+    </w:p>
+    <w:p>
+      <w:r>
+        <w:pict w14:anchorId="45BAC888">
+          <v:rect id="_x0000_i1074" style="width:0;height:1.5pt" o:hralign="center" o:hrstd="t" o:hr="t" fillcolor="#a0a0a0" stroked="f"/>
+        </w:pict>
+      </w:r>
+    </w:p>
+    <w:p>
+      <w:pPr>
+        <w:pStyle w:val="Heading2"/>
+      </w:pPr>
+      <w:r>
+        <w:rPr>
+          <w:rFonts w:ascii="Segoe UI Emoji" w:hAnsi="Segoe UI Emoji" w:cs="Segoe UI Emoji"/>
+        </w:rPr>
+        <w:t>✅</w:t>
+      </w:r>
+      <w:r>
+        <w:t xml:space="preserve"> 1. Install Git (One Time)</w:t>
+      </w:r>
+    </w:p>
+    <w:p>
+      <w:pPr>
+        <w:pStyle w:val="NormalWeb"/>
+      </w:pPr>
+      <w:r>
+        <w:t>Download from:</w:t>
+      </w:r>
+    </w:p>
+    <w:p>
+      <w:pPr>
+        <w:pStyle w:val="NormalWeb"/>
+      </w:pPr>
+      <w:r>
+        <w:rPr>
+          <w:rFonts w:ascii="Segoe UI Emoji" w:hAnsi="Segoe UI Emoji" w:cs="Segoe UI Emoji"/>
+        </w:rPr>
+        <w:lastRenderedPageBreak/>
+        <w:t>👉</w:t>
+      </w:r>
+      <w:r>
+        <w:t xml:space="preserve"> </w:t>
+      </w:r>
+      <w:hyperlink r:id="rId7" w:history="1">
+        <w:r>
+          <w:rPr>
+            <w:rStyle w:val="Hyperlink"/>
+          </w:rPr>
+          <w:t>https://git-scm.com</w:t>
+        </w:r>
+      </w:hyperlink>
+    </w:p>
+    <w:p>
+      <w:pPr>
+        <w:pStyle w:val="NormalWeb"/>
+      </w:pPr>
+      <w:r>
+        <w:t>Verify:</w:t>
+      </w:r>
+    </w:p>
+    <w:p>
+      <w:pPr>
+        <w:pStyle w:val="HTMLPreformatted"/>
+        <w:rPr>
+          <w:rStyle w:val="HTMLCode"/>
+        </w:rPr>
+      </w:pPr>
+      <w:r>
+        <w:rPr>
+          <w:rStyle w:val="HTMLCode"/>
+        </w:rPr>
+        <w:t>git --version</w:t>
+      </w:r>
+    </w:p>
+    <w:p>
+      <w:r>
+        <w:pict w14:anchorId="29ABD89B">
+          <v:rect id="_x0000_i1075" style="width:0;height:1.5pt" o:hralign="center" o:hrstd="t" o:hr="t" fillcolor="#a0a0a0" stroked="f"/>
+        </w:pict>
+      </w:r>
+    </w:p>
+    <w:p>
+      <w:pPr>
+        <w:pStyle w:val="Heading2"/>
+      </w:pPr>
+      <w:r>
+        <w:rPr>
+          <w:rFonts w:ascii="Segoe UI Emoji" w:hAnsi="Segoe UI Emoji" w:cs="Segoe UI Emoji"/>
+        </w:rPr>
+        <w:t>✅</w:t>
+      </w:r>
+      <w:r>
+        <w:t xml:space="preserve"> 2. Configure Git (One Time)</w:t>
+      </w:r>
+    </w:p>
+    <w:p>
+      <w:pPr>
+        <w:pStyle w:val="HTMLPreformatted"/>
+        <w:rPr>
+          <w:rStyle w:val="HTMLCode"/>
+        </w:rPr>
+      </w:pPr>
+      <w:r>
+        <w:rPr>
+          <w:rStyle w:val="HTMLCode"/>
+        </w:rPr>
+        <w:t>git config --global user.name "Sachin Rathi"</w:t>
+      </w:r>
+    </w:p>
+    <w:p>
+      <w:pPr>
+        <w:pStyle w:val="HTMLPreformatted"/>
+        <w:rPr>
+          <w:rStyle w:val="HTMLCode"/>
+        </w:rPr>
+      </w:pPr>
+      <w:r>
+        <w:rPr>
+          <w:rStyle w:val="HTMLCode"/>
+        </w:rPr>
+        <w:t>git config --global user.email "sacrathi1991@gmail.com"</w:t>
+      </w:r>
+    </w:p>
+    <w:p>
+      <w:r>
+        <w:pict w14:anchorId="40A18BEC">
+          <v:rect id="_x0000_i1076" style="width:0;height:1.5pt" o:hralign="center" o:hrstd="t" o:hr="t" fillcolor="#a0a0a0" stroked="f"/>
+        </w:pict>
+      </w:r>
+    </w:p>
+    <w:p>
+      <w:pPr>
+        <w:pStyle w:val="Heading2"/>
+      </w:pPr>
+      <w:r>
+        <w:rPr>
+          <w:rFonts w:ascii="Segoe UI Emoji" w:hAnsi="Segoe UI Emoji" w:cs="Segoe UI Emoji"/>
+        </w:rPr>
+        <w:t>✅</w:t>
+      </w:r>
+      <w:r>
+        <w:t xml:space="preserve"> 3. Create Repository on GitHub</w:t>
+      </w:r>
+    </w:p>
+    <w:p>
+      <w:pPr>
+        <w:pStyle w:val="NormalWeb"/>
+      </w:pPr>
+      <w:r>
+        <w:t>Go to:</w:t>
+      </w:r>
+    </w:p>
+    <w:p>
+      <w:pPr>
+        <w:pStyle w:val="NormalWeb"/>
+      </w:pPr>
+      <w:r>
+        <w:rPr>
+          <w:rFonts w:ascii="Segoe UI Emoji" w:hAnsi="Segoe UI Emoji" w:cs="Segoe UI Emoji"/>
+        </w:rPr>
+        <w:t>👉</w:t>
+      </w:r>
+      <w:r>
+        <w:t xml:space="preserve"> </w:t>
+      </w:r>
+      <w:r>
+        <w:rPr>
+          <w:rStyle w:val="Strong"/>
+          <w:rFonts w:eastAsiaTheme="majorEastAsia"/>
+        </w:rPr>
+        <w:t>GitHub</w:t>
+      </w:r>
+    </w:p>
+    <w:p>
+      <w:pPr>
+        <w:pStyle w:val="NormalWeb"/>
+      </w:pPr>
+      <w:r>
+        <w:t>Click:</w:t>
+      </w:r>
+      <w:r>
+        <w:br/>
+        <w:t>New Repository</w:t>
+      </w:r>
+    </w:p>
+    <w:p>
+      <w:pPr>
+        <w:pStyle w:val="NormalWeb"/>
+      </w:pPr>
+      <w:r>
+        <w:t>Name:</w:t>
+      </w:r>
+    </w:p>
+    <w:p>
+      <w:pPr>
+        <w:pStyle w:val="HTMLPreformatted"/>
+        <w:rPr>
+          <w:rStyle w:val="HTMLCode"/>
+        </w:rPr>
+      </w:pPr>
+      <w:r>
+        <w:rPr>
+          <w:rStyle w:val="HTMLCode"/>
+        </w:rPr>
+        <w:t>forecast-project</w:t>
+      </w:r>
+    </w:p>
+    <w:p>
+      <w:pPr>
+        <w:pStyle w:val="NormalWeb"/>
+      </w:pPr>
+      <w:r>
+        <w:t>Important:</w:t>
+      </w:r>
+    </w:p>
+    <w:p>
+      <w:pPr>
+        <w:pStyle w:val="NormalWeb"/>
+        <w:numPr>
+          <w:ilvl w:val="0"/>
+          <w:numId w:val="14"/>
+        </w:numPr>
+      </w:pPr>
+      <w:r>
+        <w:t>Do NOT initialize with README</w:t>
+      </w:r>
+    </w:p>
+    <w:p>
+      <w:pPr>
+        <w:pStyle w:val="NormalWeb"/>
+        <w:numPr>
+          <w:ilvl w:val="0"/>
+          <w:numId w:val="14"/>
+        </w:numPr>
+      </w:pPr>
+      <w:r>
+        <w:t>Keep empty</w:t>
+      </w:r>
+    </w:p>
+    <w:p>
+      <w:pPr>
+        <w:pStyle w:val="NormalWeb"/>
+      </w:pPr>
+      <w:r>
+        <w:t>Copy the repository URL:</w:t>
+      </w:r>
+    </w:p>
+    <w:p>
+      <w:pPr>
+        <w:pStyle w:val="HTMLPreformatted"/>
+        <w:rPr>
+          <w:rStyle w:val="HTMLCode"/>
+        </w:rPr>
+      </w:pPr>
+      <w:r>
+        <w:rPr>
+          <w:rStyle w:val="HTMLCode"/>
+        </w:rPr>
+        <w:t>https://github.com/sacrathi1991/forecast-project.git</w:t>
+      </w:r>
+    </w:p>
+    <w:p>
+      <w:r>
+        <w:pict w14:anchorId="1081BFDE">
+          <v:rect id="_x0000_i1077" style="width:0;height:1.5pt" o:hralign="center" o:hrstd="t" o:hr="t" fillcolor="#a0a0a0" stroked="f"/>
+        </w:pict>
+      </w:r>
+    </w:p>
+    <w:p>
+      <w:pPr>
+        <w:pStyle w:val="Heading2"/>
+      </w:pPr>
+      <w:r>
+        <w:rPr>
+          <w:rFonts w:ascii="Segoe UI Emoji" w:hAnsi="Segoe UI Emoji" w:cs="Segoe UI Emoji"/>
+        </w:rPr>
+        <w:t>✅</w:t>
+      </w:r>
+      <w:r>
+        <w:t xml:space="preserve"> 4. Initialize Git in Your Local Project</w:t>
+      </w:r>
+    </w:p>
+    <w:p>
+      <w:pPr>
+        <w:pStyle w:val="NormalWeb"/>
+      </w:pPr>
+      <w:r>
+        <w:t>Open VS Code → open your project folder.</w:t>
+      </w:r>
+    </w:p>
+    <w:p>
+      <w:pPr>
+        <w:pStyle w:val="NormalWeb"/>
+      </w:pPr>
+      <w:r>
+        <w:t>In terminal:</w:t>
+      </w:r>
+    </w:p>
+    <w:p>
+      <w:pPr>
+        <w:pStyle w:val="HTMLPreformatted"/>
+        <w:rPr>
+          <w:rStyle w:val="HTMLCode"/>
+        </w:rPr>
+      </w:pPr>
+      <w:r>
+        <w:rPr>
+          <w:rStyle w:val="HTMLCode"/>
+        </w:rPr>
+        <w:t>git init</w:t>
+      </w:r>
+    </w:p>
+    <w:p>
+      <w:pPr>
+        <w:pStyle w:val="HTMLPreformatted"/>
+        <w:rPr>
+          <w:rStyle w:val="HTMLCode"/>
+        </w:rPr>
+      </w:pPr>
+      <w:r>
+        <w:rPr>
+          <w:rStyle w:val="HTMLCode"/>
+        </w:rPr>
+        <w:t>git add .</w:t>
+      </w:r>
+    </w:p>
+    <w:p>
+      <w:pPr>
+        <w:pStyle w:val="HTMLPreformatted"/>
+        <w:rPr>
+          <w:rStyle w:val="HTMLCode"/>
+        </w:rPr>
+      </w:pPr>
+      <w:r>
+        <w:rPr>
+          <w:rStyle w:val="HTMLCode"/>
+        </w:rPr>
+        <w:t>git commit -m "Initial commit"</w:t>
+      </w:r>
+    </w:p>
+    <w:p>
+      <w:r>
+        <w:pict w14:anchorId="5CAA6709">
+          <v:rect id="_x0000_i1078" style="width:0;height:1.5pt" o:hralign="center" o:hrstd="t" o:hr="t" fillcolor="#a0a0a0" stroked="f"/>
+        </w:pict>
+      </w:r>
+    </w:p>
+    <w:p>
+      <w:pPr>
+        <w:pStyle w:val="Heading2"/>
+      </w:pPr>
+      <w:r>
+        <w:rPr>
+          <w:rFonts w:ascii="Segoe UI Emoji" w:hAnsi="Segoe UI Emoji" w:cs="Segoe UI Emoji"/>
+        </w:rPr>
+        <w:t>✅</w:t>
+      </w:r>
+      <w:r>
+        <w:t xml:space="preserve"> 5. Connect Local Repo to GitHub</w:t>
+      </w:r>
+    </w:p>
+    <w:p>
+      <w:pPr>
+        <w:pStyle w:val="HTMLPreformatted"/>
+        <w:rPr>
+          <w:rStyle w:val="HTMLCode"/>
+        </w:rPr>
+      </w:pPr>
+      <w:r>
+        <w:rPr>
+          <w:rStyle w:val="HTMLCode"/>
+        </w:rPr>
+        <w:t>git remote add origin https://github.com/sacrathi1991/forecast-project.git</w:t>
+      </w:r>
+    </w:p>
+    <w:p>
+      <w:pPr>
+        <w:pStyle w:val="HTMLPreformatted"/>
+        <w:rPr>
+          <w:rStyle w:val="HTMLCode"/>
+        </w:rPr>
+      </w:pPr>
+      <w:r>
+        <w:rPr>
+          <w:rStyle w:val="HTMLCode"/>
+        </w:rPr>
+        <w:t>git branch -M main</w:t>
+      </w:r>
+    </w:p>
+    <w:p>
+      <w:pPr>
+        <w:pStyle w:val="HTMLPreformatted"/>
+        <w:rPr>
+          <w:rStyle w:val="HTMLCode"/>
+        </w:rPr>
+      </w:pPr>
+      <w:r>
+        <w:rPr>
+          <w:rStyle w:val="HTMLCode"/>
+        </w:rPr>
+        <w:t>git push -u origin main</w:t>
+      </w:r>
+    </w:p>
+    <w:p>
+      <w:pPr>
+        <w:pStyle w:val="NormalWeb"/>
+      </w:pPr>
+      <w:r>
+        <w:t>Now your code is on GitHub main branch.</w:t>
+      </w:r>
+    </w:p>
+    <w:p>
+      <w:r>
+        <w:lastRenderedPageBreak/>
+        <w:pict w14:anchorId="103FB7BD">
+          <v:rect id="_x0000_i1079" style="width:0;height:1.5pt" o:hralign="center" o:hrstd="t" o:hr="t" fillcolor="#a0a0a0" stroked="f"/>
+        </w:pict>
+      </w:r>
+    </w:p>
+    <w:p>
+      <w:pPr>
+        <w:pStyle w:val="Heading2"/>
+      </w:pPr>
+      <w:r>
+        <w:rPr>
+          <w:rFonts w:ascii="Segoe UI Emoji" w:hAnsi="Segoe UI Emoji" w:cs="Segoe UI Emoji"/>
+        </w:rPr>
+        <w:t>🔵</w:t>
+      </w:r>
+      <w:r>
+        <w:t xml:space="preserve"> PART 2 — Setup GCP Infrastructure</w:t>
+      </w:r>
+    </w:p>
+    <w:p>
+      <w:r>
+        <w:pict w14:anchorId="77787D9C">
+          <v:rect id="_x0000_i1080" style="width:0;height:1.5pt" o:hralign="center" o:hrstd="t" o:hr="t" fillcolor="#a0a0a0" stroked="f"/>
+        </w:pict>
+      </w:r>
+    </w:p>
+    <w:p>
+      <w:pPr>
+        <w:pStyle w:val="Heading2"/>
+      </w:pPr>
+      <w:r>
+        <w:rPr>
+          <w:rFonts w:ascii="Segoe UI Emoji" w:hAnsi="Segoe UI Emoji" w:cs="Segoe UI Emoji"/>
+        </w:rPr>
+        <w:t>✅</w:t>
+      </w:r>
+      <w:r>
+        <w:t xml:space="preserve"> 6. Enable Required APIs</w:t>
+      </w:r>
+    </w:p>
+    <w:p>
+      <w:pPr>
+        <w:pStyle w:val="NormalWeb"/>
+      </w:pPr>
+      <w:r>
+        <w:t>In Google Cloud Console enable:</w:t>
+      </w:r>
+    </w:p>
+    <w:p>
+      <w:pPr>
+        <w:pStyle w:val="NormalWeb"/>
+        <w:numPr>
+          <w:ilvl w:val="0"/>
+          <w:numId w:val="15"/>
+        </w:numPr>
+      </w:pPr>
+      <w:r>
+        <w:rPr>
+          <w:rStyle w:val="Strong"/>
+          <w:rFonts w:eastAsiaTheme="majorEastAsia"/>
+        </w:rPr>
+        <w:t>Cloud Build</w:t>
+      </w:r>
+    </w:p>
+    <w:p>
+      <w:pPr>
+        <w:pStyle w:val="NormalWeb"/>
+        <w:numPr>
+          <w:ilvl w:val="0"/>
+          <w:numId w:val="15"/>
+        </w:numPr>
+      </w:pPr>
+      <w:r>
+        <w:rPr>
+          <w:rStyle w:val="Strong"/>
+          <w:rFonts w:eastAsiaTheme="majorEastAsia"/>
+        </w:rPr>
+        <w:t>Google Artifact Registry</w:t>
+      </w:r>
+    </w:p>
+    <w:p>
+      <w:pPr>
+        <w:pStyle w:val="NormalWeb"/>
+        <w:numPr>
+          <w:ilvl w:val="0"/>
+          <w:numId w:val="15"/>
+        </w:numPr>
+      </w:pPr>
+      <w:r>
+        <w:rPr>
+          <w:rStyle w:val="Strong"/>
+          <w:rFonts w:eastAsiaTheme="majorEastAsia"/>
+        </w:rPr>
+        <w:t>Cloud Run</w:t>
+      </w:r>
+    </w:p>
+    <w:p>
+      <w:pPr>
+        <w:pStyle w:val="NormalWeb"/>
+        <w:numPr>
+          <w:ilvl w:val="0"/>
+          <w:numId w:val="15"/>
+        </w:numPr>
+      </w:pPr>
+      <w:r>
+        <w:t>Cloud Scheduler API</w:t>
+      </w:r>
+    </w:p>
+    <w:p>
+      <w:r>
+        <w:pict w14:anchorId="6477D377">
+          <v:rect id="_x0000_i1081" style="width:0;height:1.5pt" o:hralign="center" o:hrstd="t" o:hr="t" fillcolor="#a0a0a0" stroked="f"/>
+        </w:pict>
+      </w:r>
+    </w:p>
+    <w:p>
+      <w:pPr>
+        <w:pStyle w:val="Heading2"/>
+      </w:pPr>
+      <w:r>
+        <w:rPr>
+          <w:rFonts w:ascii="Segoe UI Emoji" w:hAnsi="Segoe UI Emoji" w:cs="Segoe UI Emoji"/>
+        </w:rPr>
+        <w:t>✅</w:t>
+      </w:r>
+      <w:r>
+        <w:t xml:space="preserve"> 7. Create Artifact Registry</w:t>
+      </w:r>
+    </w:p>
+    <w:p>
+      <w:pPr>
+        <w:pStyle w:val="NormalWeb"/>
+      </w:pPr>
+      <w:r>
+        <w:t>Go to Artifact Registry → Create Repository</w:t>
+      </w:r>
+    </w:p>
+    <w:p>
+      <w:pPr>
+        <w:pStyle w:val="NormalWeb"/>
+      </w:pPr>
+      <w:r>
+        <w:t>Settings:</w:t>
+      </w:r>
+    </w:p>
+    <w:p>
+      <w:pPr>
+        <w:pStyle w:val="NormalWeb"/>
+      </w:pPr>
+      <w:r>
+        <w:t>Name:</w:t>
+      </w:r>
+    </w:p>
+    <w:p>
+      <w:pPr>
+        <w:pStyle w:val="HTMLPreformatted"/>
+        <w:rPr>
+          <w:rStyle w:val="HTMLCode"/>
+        </w:rPr>
+      </w:pPr>
+      <w:r>
+        <w:rPr>
+          <w:rStyle w:val="HTMLCode"/>
+        </w:rPr>
+        <w:t>forecast-repo</w:t>
+      </w:r>
+    </w:p>
+    <w:p>
+      <w:pPr>
+        <w:pStyle w:val="NormalWeb"/>
+      </w:pPr>
+      <w:r>
+        <w:t>Format:</w:t>
+      </w:r>
+      <w:r>
+        <w:br/>
+        <w:t>Docker</w:t>
+      </w:r>
+    </w:p>
+    <w:p>
+      <w:pPr>
+        <w:pStyle w:val="NormalWeb"/>
+      </w:pPr>
+      <w:r>
+        <w:t>Region:</w:t>
+      </w:r>
+    </w:p>
+    <w:p>
+      <w:pPr>
+        <w:pStyle w:val="HTMLPreformatted"/>
+        <w:rPr>
+          <w:rStyle w:val="HTMLCode"/>
+        </w:rPr>
+      </w:pPr>
+      <w:r>
+        <w:rPr>
+          <w:rStyle w:val="HTMLCode"/>
+        </w:rPr>
+        <w:t>asia-south1</w:t>
+      </w:r>
+    </w:p>
+    <w:p>
+      <w:pPr>
+        <w:pStyle w:val="NormalWeb"/>
+      </w:pPr>
+      <w:r>
+        <w:t>Click Create.</w:t>
+      </w:r>
+    </w:p>
+    <w:p>
+      <w:r>
+        <w:pict w14:anchorId="63F85791">
+          <v:rect id="_x0000_i1082" style="width:0;height:1.5pt" o:hralign="center" o:hrstd="t" o:hr="t" fillcolor="#a0a0a0" stroked="f"/>
+        </w:pict>
+      </w:r>
+    </w:p>
+    <w:p>
+      <w:pPr>
+        <w:pStyle w:val="Heading2"/>
+      </w:pPr>
+      <w:r>
+        <w:rPr>
+          <w:rFonts w:ascii="Segoe UI Emoji" w:hAnsi="Segoe UI Emoji" w:cs="Segoe UI Emoji"/>
+        </w:rPr>
+        <w:t>🔵</w:t>
+      </w:r>
+      <w:r>
+        <w:t xml:space="preserve"> </w:t>
+      </w:r>
+      <w:r>
+        <w:rPr>
+          <w:rFonts w:ascii="Segoe UI Emoji" w:hAnsi="Segoe UI Emoji" w:cs="Segoe UI Emoji"/>
+        </w:rPr>
+        <w:t>PART</w:t>
+      </w:r>
+      <w:r>
+        <w:t xml:space="preserve"> 3 — Connect GitHub to Cloud Build</w:t>
+      </w:r>
+    </w:p>
+    <w:p>
+      <w:r>
+        <w:pict w14:anchorId="49443FA0">
+          <v:rect id="_x0000_i1083" style="width:0;height:1.5pt" o:hralign="center" o:hrstd="t" o:hr="t" fillcolor="#a0a0a0" stroked="f"/>
+        </w:pict>
+      </w:r>
+    </w:p>
+    <w:p>
+      <w:pPr>
+        <w:pStyle w:val="Heading2"/>
+      </w:pPr>
+      <w:r>
+        <w:rPr>
+          <w:rFonts w:ascii="Segoe UI Emoji" w:hAnsi="Segoe UI Emoji" w:cs="Segoe UI Emoji"/>
+        </w:rPr>
+        <w:t>✅</w:t>
+      </w:r>
+      <w:r>
+        <w:t xml:space="preserve"> 8. Create Cloud Build Trigger</w:t>
+      </w:r>
+    </w:p>
+    <w:p>
+      <w:pPr>
+        <w:pStyle w:val="NormalWeb"/>
+      </w:pPr>
+      <w:r>
+        <w:t>Go to:</w:t>
+      </w:r>
+    </w:p>
+    <w:p>
+      <w:pPr>
+        <w:pStyle w:val="NormalWeb"/>
+      </w:pPr>
+      <w:r>
+        <w:t>Cloud Build → Triggers → Create Trigger</w:t>
+      </w:r>
+    </w:p>
+    <w:p>
+      <w:r>
+        <w:pict w14:anchorId="5A49B0D2">
+          <v:rect id="_x0000_i1084" style="width:0;height:1.5pt" o:hralign="center" o:hrstd="t" o:hr="t" fillcolor="#a0a0a0" stroked="f"/>
+        </w:pict>
+      </w:r>
+    </w:p>
+    <w:p>
+      <w:pPr>
+        <w:pStyle w:val="Heading3"/>
+      </w:pPr>
+      <w:r>
+        <w:lastRenderedPageBreak/>
+        <w:t>Source Section</w:t>
+      </w:r>
+    </w:p>
+    <w:p>
+      <w:pPr>
+        <w:pStyle w:val="NormalWeb"/>
+      </w:pPr>
+      <w:r>
+        <w:t>Repository service:</w:t>
+      </w:r>
+      <w:r>
+        <w:br/>
+      </w:r>
+      <w:r>
+        <w:rPr>
+          <w:rFonts w:ascii="Segoe UI Emoji" w:hAnsi="Segoe UI Emoji" w:cs="Segoe UI Emoji"/>
+        </w:rPr>
+        <w:t>✔</w:t>
+      </w:r>
+      <w:r>
+        <w:t xml:space="preserve"> Developer Connect</w:t>
+      </w:r>
+      <w:r>
+        <w:br/>
+      </w:r>
+      <w:r>
+        <w:rPr>
+          <w:rFonts w:ascii="Segoe UI Emoji" w:hAnsi="Segoe UI Emoji" w:cs="Segoe UI Emoji"/>
+        </w:rPr>
+        <w:t>✔</w:t>
+      </w:r>
+      <w:r>
+        <w:t xml:space="preserve"> 2nd gen</w:t>
+      </w:r>
+    </w:p>
+    <w:p>
+      <w:pPr>
+        <w:pStyle w:val="NormalWeb"/>
+      </w:pPr>
+      <w:r>
+        <w:t>Click Create Connection.</w:t>
+      </w:r>
+    </w:p>
+    <w:p>
+      <w:r>
+        <w:pict w14:anchorId="58113E02">
+          <v:rect id="_x0000_i1085" style="width:0;height:1.5pt" o:hralign="center" o:hrstd="t" o:hr="t" fillcolor="#a0a0a0" stroked="f"/>
+        </w:pict>
+      </w:r>
+    </w:p>
+    <w:p>
+      <w:pPr>
+        <w:pStyle w:val="Heading2"/>
+      </w:pPr>
+      <w:r>
+        <w:rPr>
+          <w:rFonts w:ascii="Segoe UI Emoji" w:hAnsi="Segoe UI Emoji" w:cs="Segoe UI Emoji"/>
+        </w:rPr>
+        <w:t>✅</w:t>
+      </w:r>
+      <w:r>
+        <w:t xml:space="preserve"> 9. Connect GitHub</w:t>
+      </w:r>
+    </w:p>
+    <w:p>
+      <w:pPr>
+        <w:pStyle w:val="NormalWeb"/>
+        <w:numPr>
+          <w:ilvl w:val="0"/>
+          <w:numId w:val="16"/>
+        </w:numPr>
+      </w:pPr>
+      <w:r>
+        <w:t>Provider → GitHub</w:t>
+      </w:r>
+    </w:p>
+    <w:p>
+      <w:pPr>
+        <w:pStyle w:val="NormalWeb"/>
+        <w:numPr>
+          <w:ilvl w:val="0"/>
+          <w:numId w:val="16"/>
+        </w:numPr>
+      </w:pPr>
+      <w:r>
+        <w:t>Install Cloud Build GitHub App</w:t>
+      </w:r>
+    </w:p>
+    <w:p>
+      <w:pPr>
+        <w:pStyle w:val="NormalWeb"/>
+        <w:numPr>
+          <w:ilvl w:val="0"/>
+          <w:numId w:val="16"/>
+        </w:numPr>
+      </w:pPr>
+      <w:r>
+        <w:t xml:space="preserve">Select your repository: </w:t>
+      </w:r>
+      <w:r>
+        <w:rPr>
+          <w:rStyle w:val="HTMLCode"/>
+        </w:rPr>
+        <w:t>forecast-project</w:t>
+      </w:r>
+    </w:p>
+    <w:p>
+      <w:pPr>
+        <w:pStyle w:val="NormalWeb"/>
+        <w:numPr>
+          <w:ilvl w:val="0"/>
+          <w:numId w:val="16"/>
+        </w:numPr>
+      </w:pPr>
+      <w:r>
+        <w:t>Approve</w:t>
+      </w:r>
+    </w:p>
+    <w:p>
+      <w:pPr>
+        <w:pStyle w:val="NormalWeb"/>
+      </w:pPr>
+      <w:r>
+        <w:t>Return to trigger screen.</w:t>
+      </w:r>
+    </w:p>
+    <w:p>
+      <w:pPr>
+        <w:pStyle w:val="NormalWeb"/>
+      </w:pPr>
+      <w:r>
+        <w:t>Now select:</w:t>
+      </w:r>
+    </w:p>
+    <w:p>
+      <w:pPr>
+        <w:pStyle w:val="NormalWeb"/>
+      </w:pPr>
+      <w:r>
+        <w:t>Repository:</w:t>
+      </w:r>
+    </w:p>
+    <w:p>
+      <w:pPr>
+        <w:pStyle w:val="HTMLPreformatted"/>
+        <w:rPr>
+          <w:rStyle w:val="HTMLCode"/>
+        </w:rPr>
+      </w:pPr>
+      <w:r>
+        <w:rPr>
+          <w:rStyle w:val="HTMLCode"/>
+        </w:rPr>
+        <w:t>forecast-project</w:t>
+      </w:r>
+    </w:p>
+    <w:p>
+      <w:pPr>
+        <w:pStyle w:val="NormalWeb"/>
+      </w:pPr>
+      <w:r>
+        <w:t>Branch:</w:t>
+      </w:r>
+    </w:p>
+    <w:p>
+      <w:pPr>
+        <w:pStyle w:val="HTMLPreformatted"/>
+        <w:rPr>
+          <w:rStyle w:val="HTMLCode"/>
+        </w:rPr>
+      </w:pPr>
+      <w:r>
+        <w:rPr>
+          <w:rStyle w:val="HTMLCode"/>
+        </w:rPr>
+        <w:t>^main$</w:t>
+      </w:r>
+    </w:p>
+    <w:p>
+      <w:pPr>
+        <w:pStyle w:val="NormalWeb"/>
+      </w:pPr>
+      <w:r>
+        <w:t>This means:</w:t>
+      </w:r>
+      <w:r>
+        <w:br/>
+        <w:t>Trigger only when pushing to main.</w:t>
+      </w:r>
+    </w:p>
+    <w:p>
+      <w:r>
+        <w:pict w14:anchorId="2884A4C6">
+          <v:rect id="_x0000_i1086" style="width:0;height:1.5pt" o:hralign="center" o:hrstd="t" o:hr="t" fillcolor="#a0a0a0" stroked="f"/>
+        </w:pict>
+      </w:r>
+    </w:p>
+    <w:p>
+      <w:pPr>
+        <w:pStyle w:val="Heading2"/>
+      </w:pPr>
+      <w:r>
+        <w:rPr>
+          <w:rFonts w:ascii="Segoe UI Emoji" w:hAnsi="Segoe UI Emoji" w:cs="Segoe UI Emoji"/>
+        </w:rPr>
+        <w:t>🔵</w:t>
+      </w:r>
+      <w:r>
+        <w:t xml:space="preserve"> PART 4 — </w:t>
+      </w:r>
+      <w:r>
+        <w:rPr>
+          <w:rFonts w:ascii="Segoe UI Emoji" w:hAnsi="Segoe UI Emoji" w:cs="Segoe UI Emoji"/>
+        </w:rPr>
+        <w:t>Docker</w:t>
+      </w:r>
+      <w:r>
+        <w:t xml:space="preserve"> Build Configuration</w:t>
+      </w:r>
+    </w:p>
+    <w:p>
+      <w:r>
+        <w:pict w14:anchorId="03B215CD">
+          <v:rect id="_x0000_i1087" style="width:0;height:1.5pt" o:hralign="center" o:hrstd="t" o:hr="t" fillcolor="#a0a0a0" stroked="f"/>
+        </w:pict>
+      </w:r>
+    </w:p>
+    <w:p>
+      <w:pPr>
+        <w:pStyle w:val="Heading3"/>
+      </w:pPr>
+      <w:r>
+        <w:t>Location:</w:t>
+      </w:r>
+    </w:p>
+    <w:p>
+      <w:pPr>
+        <w:pStyle w:val="NormalWeb"/>
+      </w:pPr>
+      <w:r>
+        <w:rPr>
+          <w:rFonts w:ascii="Segoe UI Emoji" w:hAnsi="Segoe UI Emoji" w:cs="Segoe UI Emoji"/>
+        </w:rPr>
+        <w:t>✔</w:t>
+      </w:r>
+      <w:r>
+        <w:t xml:space="preserve"> Repository</w:t>
+      </w:r>
+    </w:p>
+    <w:p>
+      <w:pPr>
+        <w:pStyle w:val="Heading3"/>
+      </w:pPr>
+      <w:r>
+        <w:t>Dockerfile directory:</w:t>
+      </w:r>
+    </w:p>
+    <w:p>
+      <w:pPr>
+        <w:pStyle w:val="HTMLPreformatted"/>
+        <w:rPr>
+          <w:rStyle w:val="HTMLCode"/>
+        </w:rPr>
+      </w:pPr>
+      <w:r>
+        <w:rPr>
+          <w:rStyle w:val="HTMLCode"/>
+        </w:rPr>
+        <w:t>/</w:t>
+      </w:r>
+    </w:p>
+    <w:p>
+      <w:pPr>
+        <w:pStyle w:val="Heading3"/>
+      </w:pPr>
+      <w:r>
+        <w:t>Dockerfile name:</w:t>
+      </w:r>
+    </w:p>
+    <w:p>
+      <w:pPr>
+        <w:pStyle w:val="HTMLPreformatted"/>
+        <w:rPr>
+          <w:rStyle w:val="HTMLCode"/>
+        </w:rPr>
+      </w:pPr>
+      <w:r>
+        <w:rPr>
+          <w:rStyle w:val="HTMLCode"/>
+        </w:rPr>
+        <w:t>Dockerfile</w:t>
+      </w:r>
+    </w:p>
+    <w:p>
+      <w:pPr>
+        <w:pStyle w:val="Heading3"/>
+      </w:pPr>
+      <w:r>
+        <w:t>Image name:</w:t>
+      </w:r>
+    </w:p>
+    <w:p>
+      <w:pPr>
+        <w:pStyle w:val="HTMLPreformatted"/>
+        <w:rPr>
+          <w:rStyle w:val="HTMLCode"/>
+        </w:rPr>
+      </w:pPr>
+      <w:r>
+        <w:rPr>
+          <w:rStyle w:val="HTMLCode"/>
+        </w:rPr>
+        <w:t>asia-south1-docker.pkg.dev/project-cfd0578a-68eb-49ae-82d/forecast-repo/forecast-app:latest</w:t>
+      </w:r>
+    </w:p>
+    <w:p>
+      <w:pPr>
+        <w:pStyle w:val="NormalWeb"/>
+      </w:pPr>
+      <w:r>
+        <w:t>Click Create.</w:t>
+      </w:r>
+    </w:p>
+    <w:p>
+      <w:r>
+        <w:lastRenderedPageBreak/>
+        <w:pict w14:anchorId="61FB1317">
+          <v:rect id="_x0000_i1088" style="width:0;height:1.5pt" o:hralign="center" o:hrstd="t" o:hr="t" fillcolor="#a0a0a0" stroked="f"/>
+        </w:pict>
+      </w:r>
+    </w:p>
+    <w:p>
+      <w:pPr>
+        <w:pStyle w:val="Heading2"/>
+      </w:pPr>
+      <w:r>
+        <w:rPr>
+          <w:rFonts w:ascii="Segoe UI Emoji" w:hAnsi="Segoe UI Emoji" w:cs="Segoe UI Emoji"/>
+        </w:rPr>
+        <w:t>🔵</w:t>
+      </w:r>
+      <w:r>
+        <w:t xml:space="preserve"> PART 5 — Test CI/CD Pipeline</w:t>
+      </w:r>
+    </w:p>
+    <w:p>
+      <w:pPr>
+        <w:pStyle w:val="NormalWeb"/>
+      </w:pPr>
+      <w:r>
+        <w:t>Now go back to VS Code.</w:t>
+      </w:r>
+    </w:p>
+    <w:p>
+      <w:pPr>
+        <w:pStyle w:val="NormalWeb"/>
+      </w:pPr>
+      <w:r>
+        <w:t>Modify any file (for testing).</w:t>
+      </w:r>
+    </w:p>
+    <w:p>
+      <w:pPr>
+        <w:pStyle w:val="NormalWeb"/>
+      </w:pPr>
+      <w:r>
+        <w:t>Then run:</w:t>
+      </w:r>
+    </w:p>
+    <w:p>
+      <w:pPr>
+        <w:pStyle w:val="HTMLPreformatted"/>
+        <w:rPr>
+          <w:rStyle w:val="HTMLCode"/>
+        </w:rPr>
+      </w:pPr>
+      <w:r>
+        <w:rPr>
+          <w:rStyle w:val="HTMLCode"/>
+        </w:rPr>
+        <w:t>git add .</w:t>
+      </w:r>
+    </w:p>
+    <w:p>
+      <w:pPr>
+        <w:pStyle w:val="HTMLPreformatted"/>
+        <w:rPr>
+          <w:rStyle w:val="HTMLCode"/>
+        </w:rPr>
+      </w:pPr>
+      <w:r>
+        <w:rPr>
+          <w:rStyle w:val="HTMLCode"/>
+        </w:rPr>
+        <w:t>git commit -m "Testing CI"</w:t>
+      </w:r>
+    </w:p>
+    <w:p>
+      <w:pPr>
+        <w:pStyle w:val="HTMLPreformatted"/>
+        <w:rPr>
+          <w:rStyle w:val="HTMLCode"/>
+        </w:rPr>
+      </w:pPr>
+      <w:r>
+        <w:rPr>
+          <w:rStyle w:val="HTMLCode"/>
+        </w:rPr>
+        <w:t>git push origin main</w:t>
+      </w:r>
+    </w:p>
+    <w:p>
+      <w:pPr>
+        <w:pStyle w:val="NormalWeb"/>
+      </w:pPr>
+      <w:r>
+        <w:t>Now go to:</w:t>
+      </w:r>
+    </w:p>
+    <w:p>
+      <w:pPr>
+        <w:pStyle w:val="NormalWeb"/>
+      </w:pPr>
+      <w:r>
+        <w:t>Cloud Build → History</w:t>
+      </w:r>
+    </w:p>
+    <w:p>
+      <w:pPr>
+        <w:pStyle w:val="NormalWeb"/>
+      </w:pPr>
+      <w:r>
+        <w:t>You will see:</w:t>
+      </w:r>
+    </w:p>
+    <w:p>
+      <w:pPr>
+        <w:pStyle w:val="NormalWeb"/>
+      </w:pPr>
+      <w:r>
+        <w:t>Build running automatically.</w:t>
+      </w:r>
+    </w:p>
+    <w:p>
+      <w:pPr>
+        <w:pStyle w:val="NormalWeb"/>
+      </w:pPr>
+      <w:r>
+        <w:t>If status = SUCCESS:</w:t>
+      </w:r>
+    </w:p>
+    <w:p>
+      <w:pPr>
+        <w:pStyle w:val="NormalWeb"/>
+      </w:pPr>
+      <w:r>
+        <w:t>Docker image is now stored in Artifact Registry.</w:t>
+      </w:r>
+    </w:p>
+    <w:p>
+      <w:r>
+        <w:pict w14:anchorId="78184D57">
+          <v:rect id="_x0000_i1089" style="width:0;height:1.5pt" o:hralign="center" o:hrstd="t" o:hr="t" fillcolor="#a0a0a0" stroked="f"/>
+        </w:pict>
+      </w:r>
+    </w:p>
+    <w:p>
+      <w:pPr>
+        <w:pStyle w:val="Heading2"/>
+      </w:pPr>
+      <w:r>
+        <w:rPr>
+          <w:rFonts w:ascii="Segoe UI Emoji" w:hAnsi="Segoe UI Emoji" w:cs="Segoe UI Emoji"/>
+        </w:rPr>
+        <w:t>🔵</w:t>
+      </w:r>
+      <w:r>
+        <w:t xml:space="preserve"> </w:t>
+      </w:r>
+      <w:r>
+        <w:rPr>
+          <w:rFonts w:ascii="Segoe UI Emoji" w:hAnsi="Segoe UI Emoji" w:cs="Segoe UI Emoji"/>
+        </w:rPr>
+        <w:t>PART</w:t>
+      </w:r>
+      <w:r>
+        <w:t xml:space="preserve"> 6 — Create Cloud Run Job</w:t>
+      </w:r>
+    </w:p>
+    <w:p>
+      <w:pPr>
+        <w:pStyle w:val="NormalWeb"/>
+      </w:pPr>
+      <w:r>
+        <w:t>Go to:</w:t>
+      </w:r>
+    </w:p>
+    <w:p>
+      <w:pPr>
+        <w:pStyle w:val="NormalWeb"/>
+      </w:pPr>
+      <w:r>
+        <w:t>Cloud Run → Jobs → Create Job</w:t>
+      </w:r>
+    </w:p>
+    <w:p>
+      <w:pPr>
+        <w:pStyle w:val="NormalWeb"/>
+      </w:pPr>
+      <w:r>
+        <w:t>Name:</w:t>
+      </w:r>
+    </w:p>
+    <w:p>
+      <w:pPr>
+        <w:pStyle w:val="HTMLPreformatted"/>
+        <w:rPr>
+          <w:rStyle w:val="HTMLCode"/>
+        </w:rPr>
+      </w:pPr>
+      <w:r>
+        <w:rPr>
+          <w:rStyle w:val="HTMLCode"/>
+        </w:rPr>
+        <w:t>stock-forecast-job</w:t>
+      </w:r>
+    </w:p>
+    <w:p>
+      <w:pPr>
+        <w:pStyle w:val="NormalWeb"/>
+      </w:pPr>
+      <w:r>
+        <w:t>Select container image:</w:t>
+      </w:r>
+    </w:p>
+    <w:p>
+      <w:pPr>
+        <w:pStyle w:val="HTMLPreformatted"/>
+        <w:rPr>
+          <w:rStyle w:val="HTMLCode"/>
+        </w:rPr>
+      </w:pPr>
+      <w:r>
+        <w:rPr>
+          <w:rStyle w:val="HTMLCode"/>
+        </w:rPr>
+        <w:t>forecast-app:latest</w:t>
+      </w:r>
+    </w:p>
+    <w:p>
+      <w:pPr>
+        <w:pStyle w:val="NormalWeb"/>
+      </w:pPr>
+      <w:r>
+        <w:t>Memory: 512MB</w:t>
+      </w:r>
+      <w:r>
+        <w:br/>
+        <w:t>CPU: 1</w:t>
+      </w:r>
+      <w:r>
+        <w:br/>
+        <w:t>Timeout: 5 min</w:t>
+      </w:r>
+    </w:p>
+    <w:p>
+      <w:pPr>
+        <w:pStyle w:val="NormalWeb"/>
+      </w:pPr>
+      <w:r>
+        <w:t>Click Create.</w:t>
+      </w:r>
+    </w:p>
+    <w:p>
+      <w:r>
+        <w:pict w14:anchorId="575C09B3">
+          <v:rect id="_x0000_i1090" style="width:0;height:1.5pt" o:hralign="center" o:hrstd="t" o:hr="t" fillcolor="#a0a0a0" stroked="f"/>
+        </w:pict>
+      </w:r>
+    </w:p>
+    <w:p>
+      <w:pPr>
+        <w:pStyle w:val="Heading2"/>
+      </w:pPr>
+      <w:r>
+        <w:rPr>
+          <w:rFonts w:ascii="Segoe UI Emoji" w:hAnsi="Segoe UI Emoji" w:cs="Segoe UI Emoji"/>
+        </w:rPr>
+        <w:lastRenderedPageBreak/>
+        <w:t>🔵</w:t>
+      </w:r>
+      <w:r>
+        <w:t xml:space="preserve"> PART 7 — Attach Scheduler</w:t>
+      </w:r>
+    </w:p>
+    <w:p>
+      <w:pPr>
+        <w:pStyle w:val="NormalWeb"/>
+      </w:pPr>
+      <w:r>
+        <w:t>Go to:</w:t>
+      </w:r>
+    </w:p>
+    <w:p>
+      <w:pPr>
+        <w:pStyle w:val="NormalWeb"/>
+      </w:pPr>
+      <w:r>
+        <w:t>Cloud Scheduler → Create Job</w:t>
+      </w:r>
+    </w:p>
+    <w:p>
+      <w:pPr>
+        <w:pStyle w:val="NormalWeb"/>
+      </w:pPr>
+      <w:r>
+        <w:t>Schedule:</w:t>
+      </w:r>
+    </w:p>
+    <w:p>
+      <w:pPr>
+        <w:pStyle w:val="HTMLPreformatted"/>
+        <w:rPr>
+          <w:rStyle w:val="HTMLCode"/>
+        </w:rPr>
+      </w:pPr>
+      <w:r>
+        <w:rPr>
+          <w:rStyle w:val="HTMLCode"/>
+        </w:rPr>
+        <w:t>0 19 * * 6</w:t>
+      </w:r>
+    </w:p>
+    <w:p>
+      <w:pPr>
+        <w:pStyle w:val="NormalWeb"/>
+      </w:pPr>
+      <w:r>
+        <w:t>(Every Saturday 7 PM)</w:t>
+      </w:r>
+    </w:p>
+    <w:p>
+      <w:pPr>
+        <w:pStyle w:val="NormalWeb"/>
+      </w:pPr>
+      <w:r>
+        <w:t>Target:</w:t>
+      </w:r>
+      <w:r>
+        <w:br/>
+        <w:t>Cloud Run Job → stock-forecast-job</w:t>
+      </w:r>
+    </w:p>
+    <w:p>
+      <w:pPr>
+        <w:pStyle w:val="NormalWeb"/>
+      </w:pPr>
+      <w:r>
+        <w:t>Create.</w:t>
+      </w:r>
+    </w:p>
+    <w:p>
+      <w:r>
+        <w:pict w14:anchorId="00ED050D">
+          <v:rect id="_x0000_i1091" style="width:0;height:1.5pt" o:hralign="center" o:hrstd="t" o:hr="t" fillcolor="#a0a0a0" stroked="f"/>
+        </w:pict>
+      </w:r>
+    </w:p>
+    <w:p>
+      <w:pPr>
+        <w:pStyle w:val="Heading2"/>
+      </w:pPr>
+      <w:r>
+        <w:rPr>
+          <w:rFonts w:ascii="Segoe UI Emoji" w:hAnsi="Segoe UI Emoji" w:cs="Segoe UI Emoji"/>
+        </w:rPr>
+        <w:t>🔵</w:t>
+      </w:r>
+      <w:r>
+        <w:t xml:space="preserve"> FINAL WORKFLOW (After Setup)</w:t>
+      </w:r>
+    </w:p>
+    <w:p>
+      <w:pPr>
+        <w:pStyle w:val="NormalWeb"/>
+      </w:pPr>
+      <w:r>
+        <w:t>From now on you only do this:</w:t>
+      </w:r>
+    </w:p>
+    <w:p>
+      <w:pPr>
+        <w:pStyle w:val="HTMLPreformatted"/>
+        <w:rPr>
+          <w:rStyle w:val="HTMLCode"/>
+        </w:rPr>
+      </w:pPr>
+      <w:r>
+        <w:rPr>
+          <w:rStyle w:val="HTMLCode"/>
+        </w:rPr>
+        <w:t>git add .</w:t>
+      </w:r>
+    </w:p>
+    <w:p>
+      <w:pPr>
+        <w:pStyle w:val="HTMLPreformatted"/>
+        <w:rPr>
+          <w:rStyle w:val="HTMLCode"/>
+        </w:rPr>
+      </w:pPr>
+      <w:r>
+        <w:rPr>
+          <w:rStyle w:val="HTMLCode"/>
+        </w:rPr>
+        <w:t>git commit -m "Model update"</w:t>
+      </w:r>
+    </w:p>
+    <w:p>
+      <w:pPr>
+        <w:pStyle w:val="HTMLPreformatted"/>
+        <w:rPr>
+          <w:rStyle w:val="HTMLCode"/>
+        </w:rPr>
+      </w:pPr>
+      <w:r>
+        <w:rPr>
+          <w:rStyle w:val="HTMLCode"/>
+        </w:rPr>
+        <w:t>git push origin main</w:t>
+      </w:r>
+    </w:p>
+    <w:p>
+      <w:pPr>
+        <w:pStyle w:val="NormalWeb"/>
+      </w:pPr>
+      <w:r>
+        <w:t>Everything else happens automatically:</w:t>
+      </w:r>
+    </w:p>
+    <w:p>
+      <w:pPr>
+        <w:pStyle w:val="NormalWeb"/>
+      </w:pPr>
+      <w:r>
+        <w:t>GitHub</w:t>
+      </w:r>
+      <w:r>
+        <w:br/>
+        <w:t>→ Cloud Build builds Docker image</w:t>
+      </w:r>
+      <w:r>
+        <w:br/>
+        <w:t>→ Artifact Registry stores image</w:t>
+      </w:r>
+      <w:r>
+        <w:br/>
+        <w:t>→ Cloud Run Job uses image</w:t>
+      </w:r>
+      <w:r>
+        <w:br/>
+        <w:t>→ Scheduler runs job</w:t>
+      </w:r>
+    </w:p>
+    <w:p>
+      <w:r>
+        <w:pict w14:anchorId="1FE78237">
+          <v:rect id="_x0000_i1092" style="width:0;height:1.5pt" o:hralign="center" o:hrstd="t" o:hr="t" fillcolor="#a0a0a0" stroked="f"/>
+        </w:pict>
+      </w:r>
+    </w:p>
+    <w:p>
+      <w:pPr>
+        <w:pStyle w:val="Heading2"/>
+      </w:pPr>
+      <w:r>
+        <w:rPr>
+          <w:rFonts w:ascii="Segoe UI Emoji" w:hAnsi="Segoe UI Emoji" w:cs="Segoe UI Emoji"/>
+        </w:rPr>
+        <w:t>🔥</w:t>
+      </w:r>
+      <w:r>
+        <w:t xml:space="preserve"> </w:t>
+      </w:r>
+      <w:r>
+        <w:rPr>
+          <w:rFonts w:ascii="Segoe UI Emoji" w:hAnsi="Segoe UI Emoji" w:cs="Segoe UI Emoji"/>
+        </w:rPr>
+        <w:t>Architecture</w:t>
+      </w:r>
+      <w:r>
+        <w:t xml:space="preserve"> Summary</w:t>
+      </w:r>
+    </w:p>
+    <w:p>
+      <w:pPr>
+        <w:pStyle w:val="NormalWeb"/>
+      </w:pPr>
+      <w:r>
+        <w:t>Cloud Build = Builds container</w:t>
+      </w:r>
+      <w:r>
+        <w:br/>
+        <w:t>Artifact Registry = Stores container</w:t>
+      </w:r>
+      <w:r>
+        <w:br/>
+        <w:t>Cloud Run Job = Executes container</w:t>
+      </w:r>
+      <w:r>
+        <w:br/>
+        <w:t>Scheduler = Triggers execution</w:t>
+      </w:r>
+    </w:p>
+    <w:p>
+      <w:pPr>
+        <w:pStyle w:val="NormalWeb"/>
+      </w:pPr>
+      <w:r>
+        <w:t>Containers are always the runtime unit.</w:t>
+      </w:r>
+    </w:p>
+    <w:p>
+      <w:r>
+        <w:pict w14:anchorId="0F7B3E31">
+          <v:rect id="_x0000_i1093" style="width:0;height:1.5pt" o:hralign="center" o:hrstd="t" o:hr="t" fillcolor="#a0a0a0" stroked="f"/>
+        </w:pict>
+      </w:r>
+    </w:p>
+    <w:p>
+      <w:pPr>
+        <w:pStyle w:val="NormalWeb"/>
+      </w:pPr>
+      <w:r>
+        <w:t>You now have a production-style CI/CD system.</w:t>
+      </w:r>
+    </w:p>
+    <w:p>
+      <w:pPr>
+        <w:pStyle w:val="NormalWeb"/>
+      </w:pPr>
+      <w:r>
+        <w:lastRenderedPageBreak/>
+        <w:t>Save this.</w:t>
+      </w:r>
+    </w:p>
+    <w:p>
+      <w:pPr>
+        <w:pStyle w:val="NormalWeb"/>
+      </w:pPr>
+      <w:r>
+        <w:t>When you're ready, we’ll execute it step by step slowly and safely.</w:t>
+      </w:r>
+    </w:p>
+    <w:p>
+      <w:pPr>
         <w:rPr>
           <w:lang w:val="en-US"/>
         </w:rPr>
@@ -7652,6 +9249,155 @@
 <file path=word/numbering.xml><?xml version="1.0" encoding="utf-8"?>
 <w:numbering xmlns:wpc="http://schemas.microsoft.com/office/word/2010/wordprocessingCanvas" xmlns:cx="http://schemas.microsoft.com/office/drawing/2014/chartex" xmlns:cx1="http://schemas.microsoft.com/office/drawing/2015/9/8/chartex" xmlns:cx2="http://schemas.microsoft.com/office/drawing/2015/10/21/chartex" xmlns:cx3="http://schemas.microsoft.com/office/drawing/2016/5/9/chartex" xmlns:cx4="http://schemas.microsoft.com/office/drawing/2016/5/10/chartex" xmlns:cx5="http://schemas.microsoft.com/office/drawing/2016/5/11/chartex" xmlns:cx6="http://schemas.microsoft.com/office/drawing/2016/5/12/chartex" xmlns:cx7="http://schemas.microsoft.com/office/drawing/2016/5/13/chartex" xmlns:cx8="http://schemas.microsoft.com/office/drawing/2016/5/14/chartex" xmlns:mc="http://schemas.openxmlformats.org/markup-compatibility/2006" xmlns:aink="http://schemas.microsoft.com/office/drawing/2016/ink" xmlns:am3d="http://schemas.microsoft.com/office/drawing/2017/model3d" xmlns:o="urn:schemas-microsoft-com:office:office" xmlns:r="http://schemas.openxmlformats.org/officeDocument/2006/relationships" xmlns:m="http://schemas.openxmlformats.org/officeDocument/2006/math" xmlns:v="urn:schemas-microsoft-com:vml" xmlns:wp14="http://schemas.microsoft.com/office/word/2010/wordprocessingDrawing" xmlns:wp="http://schemas.openxmlformats.org/drawingml/2006/wordprocessingDrawing" xmlns:w10="urn:schemas-microsoft-com:office:word" xmlns:w="http://schemas.openxmlformats.org/wordprocessingml/2006/main" xmlns:w14="http://schemas.microsoft.com/office/word/2010/wordml" xmlns:w15="http://schemas.microsoft.com/office/word/2012/wordml" xmlns:w16cex="http://schemas.microsoft.com/office/word/2018/wordml/cex" xmlns:w16cid="http://schemas.microsoft.com/office/word/2016/wordml/cid" xmlns:w16="http://schemas.microsoft.com/office/word/2018/wordml" xmlns:w16sdtdh="http://schemas.microsoft.com/office/word/2020/wordml/sdtdatahash" xmlns:w16se="http://schemas.microsoft.com/office/word/2015/wordml/symex" xmlns:wpg="http://schemas.microsoft.com/office/word/2010/wordprocessingGroup" xmlns:wpi="http://schemas.microsoft.com/office/word/2010/wordprocessingInk" xmlns:wne="http://schemas.microsoft.com/office/word/2006/wordml" xmlns:wps="http://schemas.microsoft.com/office/word/2010/wordprocessingShape" mc:Ignorable="w14 w15 w16se w16cid w16 w16cex w16sdtdh wp14">
   <w:abstractNum w:abstractNumId="0" w15:restartNumberingAfterBreak="0">
+    <w:nsid w:val="03353BC9"/>
+    <w:multiLevelType w:val="multilevel"/>
+    <w:tmpl w:val="9BE8BDA8"/>
+    <w:lvl w:ilvl="0">
+      <w:start w:val="1"/>
+      <w:numFmt w:val="bullet"/>
+      <w:lvlText w:val=""/>
+      <w:lvlJc w:val="left"/>
+      <w:pPr>
+        <w:tabs>
+          <w:tab w:val="num" w:pos="720"/>
+        </w:tabs>
+        <w:ind w:left="720" w:hanging="360"/>
+      </w:pPr>
+      <w:rPr>
+        <w:rFonts w:ascii="Symbol" w:hAnsi="Symbol" w:hint="default"/>
+        <w:sz w:val="20"/>
+      </w:rPr>
+    </w:lvl>
+    <w:lvl w:ilvl="1" w:tentative="1">
+      <w:start w:val="1"/>
+      <w:numFmt w:val="bullet"/>
+      <w:lvlText w:val="o"/>
+      <w:lvlJc w:val="left"/>
+      <w:pPr>
+        <w:tabs>
+          <w:tab w:val="num" w:pos="1440"/>
+        </w:tabs>
+        <w:ind w:left="1440" w:hanging="360"/>
+      </w:pPr>
+      <w:rPr>
+        <w:rFonts w:ascii="Courier New" w:hAnsi="Courier New" w:hint="default"/>
+        <w:sz w:val="20"/>
+      </w:rPr>
+    </w:lvl>
+    <w:lvl w:ilvl="2" w:tentative="1">
+      <w:start w:val="1"/>
+      <w:numFmt w:val="bullet"/>
+      <w:lvlText w:val=""/>
+      <w:lvlJc w:val="left"/>
+      <w:pPr>
+        <w:tabs>
+          <w:tab w:val="num" w:pos="2160"/>
+        </w:tabs>
+        <w:ind w:left="2160" w:hanging="360"/>
+      </w:pPr>
+      <w:rPr>
+        <w:rFonts w:ascii="Wingdings" w:hAnsi="Wingdings" w:hint="default"/>
+        <w:sz w:val="20"/>
+      </w:rPr>
+    </w:lvl>
+    <w:lvl w:ilvl="3" w:tentative="1">
+      <w:start w:val="1"/>
+      <w:numFmt w:val="bullet"/>
+      <w:lvlText w:val=""/>
+      <w:lvlJc w:val="left"/>
+      <w:pPr>
+        <w:tabs>
+          <w:tab w:val="num" w:pos="2880"/>
+        </w:tabs>
+        <w:ind w:left="2880" w:hanging="360"/>
+      </w:pPr>
+      <w:rPr>
+        <w:rFonts w:ascii="Wingdings" w:hAnsi="Wingdings" w:hint="default"/>
+        <w:sz w:val="20"/>
+      </w:rPr>
+    </w:lvl>
+    <w:lvl w:ilvl="4" w:tentative="1">
+      <w:start w:val="1"/>
+      <w:numFmt w:val="bullet"/>
+      <w:lvlText w:val=""/>
+      <w:lvlJc w:val="left"/>
+      <w:pPr>
+        <w:tabs>
+          <w:tab w:val="num" w:pos="3600"/>
+        </w:tabs>
+        <w:ind w:left="3600" w:hanging="360"/>
+      </w:pPr>
+      <w:rPr>
+        <w:rFonts w:ascii="Wingdings" w:hAnsi="Wingdings" w:hint="default"/>
+        <w:sz w:val="20"/>
+      </w:rPr>
+    </w:lvl>
+    <w:lvl w:ilvl="5" w:tentative="1">
+      <w:start w:val="1"/>
+      <w:numFmt w:val="bullet"/>
+      <w:lvlText w:val=""/>
+      <w:lvlJc w:val="left"/>
+      <w:pPr>
+        <w:tabs>
+          <w:tab w:val="num" w:pos="4320"/>
+        </w:tabs>
+        <w:ind w:left="4320" w:hanging="360"/>
+      </w:pPr>
+      <w:rPr>
+        <w:rFonts w:ascii="Wingdings" w:hAnsi="Wingdings" w:hint="default"/>
+        <w:sz w:val="20"/>
+      </w:rPr>
+    </w:lvl>
+    <w:lvl w:ilvl="6" w:tentative="1">
+      <w:start w:val="1"/>
+      <w:numFmt w:val="bullet"/>
+      <w:lvlText w:val=""/>
+      <w:lvlJc w:val="left"/>
+      <w:pPr>
+        <w:tabs>
+          <w:tab w:val="num" w:pos="5040"/>
+        </w:tabs>
+        <w:ind w:left="5040" w:hanging="360"/>
+      </w:pPr>
+      <w:rPr>
+        <w:rFonts w:ascii="Wingdings" w:hAnsi="Wingdings" w:hint="default"/>
+        <w:sz w:val="20"/>
+      </w:rPr>
+    </w:lvl>
+    <w:lvl w:ilvl="7" w:tentative="1">
+      <w:start w:val="1"/>
+      <w:numFmt w:val="bullet"/>
+      <w:lvlText w:val=""/>
+      <w:lvlJc w:val="left"/>
+      <w:pPr>
+        <w:tabs>
+          <w:tab w:val="num" w:pos="5760"/>
+        </w:tabs>
+        <w:ind w:left="5760" w:hanging="360"/>
+      </w:pPr>
+      <w:rPr>
+        <w:rFonts w:ascii="Wingdings" w:hAnsi="Wingdings" w:hint="default"/>
+        <w:sz w:val="20"/>
+      </w:rPr>
+    </w:lvl>
+    <w:lvl w:ilvl="8" w:tentative="1">
+      <w:start w:val="1"/>
+      <w:numFmt w:val="bullet"/>
+      <w:lvlText w:val=""/>
+      <w:lvlJc w:val="left"/>
+      <w:pPr>
+        <w:tabs>
+          <w:tab w:val="num" w:pos="6480"/>
+        </w:tabs>
+        <w:ind w:left="6480" w:hanging="360"/>
+      </w:pPr>
+      <w:rPr>
+        <w:rFonts w:ascii="Wingdings" w:hAnsi="Wingdings" w:hint="default"/>
+        <w:sz w:val="20"/>
+      </w:rPr>
+    </w:lvl>
+  </w:abstractNum>
+  <w:abstractNum w:abstractNumId="1" w15:restartNumberingAfterBreak="0">
     <w:nsid w:val="0C6B1BCD"/>
     <w:multiLevelType w:val="multilevel"/>
     <w:tmpl w:val="5AD2BC04"/>
@@ -7800,7 +9546,124 @@
       </w:rPr>
     </w:lvl>
   </w:abstractNum>
-  <w:abstractNum w:abstractNumId="1" w15:restartNumberingAfterBreak="0">
+  <w:abstractNum w:abstractNumId="2" w15:restartNumberingAfterBreak="0">
+    <w:nsid w:val="0D605DB9"/>
+    <w:multiLevelType w:val="multilevel"/>
+    <w:tmpl w:val="B12C5CEA"/>
+    <w:lvl w:ilvl="0">
+      <w:start w:val="1"/>
+      <w:numFmt w:val="decimal"/>
+      <w:lvlText w:val="%1."/>
+      <w:lvlJc w:val="left"/>
+      <w:pPr>
+        <w:tabs>
+          <w:tab w:val="num" w:pos="720"/>
+        </w:tabs>
+        <w:ind w:left="720" w:hanging="360"/>
+      </w:pPr>
+    </w:lvl>
+    <w:lvl w:ilvl="1">
+      <w:start w:val="1"/>
+      <w:numFmt w:val="bullet"/>
+      <w:lvlText w:val="o"/>
+      <w:lvlJc w:val="left"/>
+      <w:pPr>
+        <w:tabs>
+          <w:tab w:val="num" w:pos="1440"/>
+        </w:tabs>
+        <w:ind w:left="1440" w:hanging="360"/>
+      </w:pPr>
+      <w:rPr>
+        <w:rFonts w:ascii="Courier New" w:hAnsi="Courier New" w:hint="default"/>
+        <w:sz w:val="20"/>
+      </w:rPr>
+    </w:lvl>
+    <w:lvl w:ilvl="2" w:tentative="1">
+      <w:start w:val="1"/>
+      <w:numFmt w:val="decimal"/>
+      <w:lvlText w:val="%3."/>
+      <w:lvlJc w:val="left"/>
+      <w:pPr>
+        <w:tabs>
+          <w:tab w:val="num" w:pos="2160"/>
+        </w:tabs>
+        <w:ind w:left="2160" w:hanging="360"/>
+      </w:pPr>
+    </w:lvl>
+    <w:lvl w:ilvl="3" w:tentative="1">
+      <w:start w:val="1"/>
+      <w:numFmt w:val="decimal"/>
+      <w:lvlText w:val="%4."/>
+      <w:lvlJc w:val="left"/>
+      <w:pPr>
+        <w:tabs>
+          <w:tab w:val="num" w:pos="2880"/>
+        </w:tabs>
+        <w:ind w:left="2880" w:hanging="360"/>
+      </w:pPr>
+    </w:lvl>
+    <w:lvl w:ilvl="4" w:tentative="1">
+      <w:start w:val="1"/>
+      <w:numFmt w:val="decimal"/>
+      <w:lvlText w:val="%5."/>
+      <w:lvlJc w:val="left"/>
+      <w:pPr>
+        <w:tabs>
+          <w:tab w:val="num" w:pos="3600"/>
+        </w:tabs>
+        <w:ind w:left="3600" w:hanging="360"/>
+      </w:pPr>
+    </w:lvl>
+    <w:lvl w:ilvl="5" w:tentative="1">
+      <w:start w:val="1"/>
+      <w:numFmt w:val="decimal"/>
+      <w:lvlText w:val="%6."/>
+      <w:lvlJc w:val="left"/>
+      <w:pPr>
+        <w:tabs>
+          <w:tab w:val="num" w:pos="4320"/>
+        </w:tabs>
+        <w:ind w:left="4320" w:hanging="360"/>
+      </w:pPr>
+    </w:lvl>
+    <w:lvl w:ilvl="6" w:tentative="1">
+      <w:start w:val="1"/>
+      <w:numFmt w:val="decimal"/>
+      <w:lvlText w:val="%7."/>
+      <w:lvlJc w:val="left"/>
+      <w:pPr>
+        <w:tabs>
+          <w:tab w:val="num" w:pos="5040"/>
+        </w:tabs>
+        <w:ind w:left="5040" w:hanging="360"/>
+      </w:pPr>
+    </w:lvl>
+    <w:lvl w:ilvl="7" w:tentative="1">
+      <w:start w:val="1"/>
+      <w:numFmt w:val="decimal"/>
+      <w:lvlText w:val="%8."/>
+      <w:lvlJc w:val="left"/>
+      <w:pPr>
+        <w:tabs>
+          <w:tab w:val="num" w:pos="5760"/>
+        </w:tabs>
+        <w:ind w:left="5760" w:hanging="360"/>
+      </w:pPr>
+    </w:lvl>
+    <w:lvl w:ilvl="8" w:tentative="1">
+      <w:start w:val="1"/>
+      <w:numFmt w:val="decimal"/>
+      <w:lvlText w:val="%9."/>
+      <w:lvlJc w:val="left"/>
+      <w:pPr>
+        <w:tabs>
+          <w:tab w:val="num" w:pos="6480"/>
+        </w:tabs>
+        <w:ind w:left="6480" w:hanging="360"/>
+      </w:pPr>
+    </w:lvl>
+  </w:abstractNum>
+  <w:abstractNum w:abstractNumId="3" w15:restartNumberingAfterBreak="0">
     <w:nsid w:val="13500DA7"/>
     <w:multiLevelType w:val="multilevel"/>
     <w:tmpl w:val="01D0EDDA"/>
@@ -7949,7 +9812,156 @@
       </w:rPr>
     </w:lvl>
   </w:abstractNum>
-  <w:abstractNum w:abstractNumId="2" w15:restartNumberingAfterBreak="0">
+  <w:abstractNum w:abstractNumId="4" w15:restartNumberingAfterBreak="0">
+    <w:nsid w:val="19312197"/>
+    <w:multiLevelType w:val="multilevel"/>
+    <w:tmpl w:val="C5D05D4C"/>
+    <w:lvl w:ilvl="0">
+      <w:start w:val="1"/>
+      <w:numFmt w:val="bullet"/>
+      <w:lvlText w:val=""/>
+      <w:lvlJc w:val="left"/>
+      <w:pPr>
+        <w:tabs>
+          <w:tab w:val="num" w:pos="720"/>
+        </w:tabs>
+        <w:ind w:left="720" w:hanging="360"/>
+      </w:pPr>
+      <w:rPr>
+        <w:rFonts w:ascii="Symbol" w:hAnsi="Symbol" w:hint="default"/>
+        <w:sz w:val="20"/>
+      </w:rPr>
+    </w:lvl>
+    <w:lvl w:ilvl="1" w:tentative="1">
+      <w:start w:val="1"/>
+      <w:numFmt w:val="bullet"/>
+      <w:lvlText w:val="o"/>
+      <w:lvlJc w:val="left"/>
+      <w:pPr>
+        <w:tabs>
+          <w:tab w:val="num" w:pos="1440"/>
+        </w:tabs>
+        <w:ind w:left="1440" w:hanging="360"/>
+      </w:pPr>
+      <w:rPr>
+        <w:rFonts w:ascii="Courier New" w:hAnsi="Courier New" w:hint="default"/>
+        <w:sz w:val="20"/>
+      </w:rPr>
+    </w:lvl>
+    <w:lvl w:ilvl="2" w:tentative="1">
+      <w:start w:val="1"/>
+      <w:numFmt w:val="bullet"/>
+      <w:lvlText w:val=""/>
+      <w:lvlJc w:val="left"/>
+      <w:pPr>
+        <w:tabs>
+          <w:tab w:val="num" w:pos="2160"/>
+        </w:tabs>
+        <w:ind w:left="2160" w:hanging="360"/>
+      </w:pPr>
+      <w:rPr>
+        <w:rFonts w:ascii="Wingdings" w:hAnsi="Wingdings" w:hint="default"/>
+        <w:sz w:val="20"/>
+      </w:rPr>
+    </w:lvl>
+    <w:lvl w:ilvl="3" w:tentative="1">
+      <w:start w:val="1"/>
+      <w:numFmt w:val="bullet"/>
+      <w:lvlText w:val=""/>
+      <w:lvlJc w:val="left"/>
+      <w:pPr>
+        <w:tabs>
+          <w:tab w:val="num" w:pos="2880"/>
+        </w:tabs>
+        <w:ind w:left="2880" w:hanging="360"/>
+      </w:pPr>
+      <w:rPr>
+        <w:rFonts w:ascii="Wingdings" w:hAnsi="Wingdings" w:hint="default"/>
+        <w:sz w:val="20"/>
+      </w:rPr>
+    </w:lvl>
+    <w:lvl w:ilvl="4" w:tentative="1">
+      <w:start w:val="1"/>
+      <w:numFmt w:val="bullet"/>
+      <w:lvlText w:val=""/>
+      <w:lvlJc w:val="left"/>
+      <w:pPr>
+        <w:tabs>
+          <w:tab w:val="num" w:pos="3600"/>
+        </w:tabs>
+        <w:ind w:left="3600" w:hanging="360"/>
+      </w:pPr>
+      <w:rPr>
+        <w:rFonts w:ascii="Wingdings" w:hAnsi="Wingdings" w:hint="default"/>
+        <w:sz w:val="20"/>
+      </w:rPr>
+    </w:lvl>
+    <w:lvl w:ilvl="5" w:tentative="1">
+      <w:start w:val="1"/>
+      <w:numFmt w:val="bullet"/>
+      <w:lvlText w:val=""/>
+      <w:lvlJc w:val="left"/>
+      <w:pPr>
+        <w:tabs>
+          <w:tab w:val="num" w:pos="4320"/>
+        </w:tabs>
+        <w:ind w:left="4320" w:hanging="360"/>
+      </w:pPr>
+      <w:rPr>
+        <w:rFonts w:ascii="Wingdings" w:hAnsi="Wingdings" w:hint="default"/>
+        <w:sz w:val="20"/>
+      </w:rPr>
+    </w:lvl>
+    <w:lvl w:ilvl="6" w:tentative="1">
+      <w:start w:val="1"/>
+      <w:numFmt w:val="bullet"/>
+      <w:lvlText w:val=""/>
+      <w:lvlJc w:val="left"/>
+      <w:pPr>
+        <w:tabs>
+          <w:tab w:val="num" w:pos="5040"/>
+        </w:tabs>
+        <w:ind w:left="5040" w:hanging="360"/>
+      </w:pPr>
+      <w:rPr>
+        <w:rFonts w:ascii="Wingdings" w:hAnsi="Wingdings" w:hint="default"/>
+        <w:sz w:val="20"/>
+      </w:rPr>
+    </w:lvl>
+    <w:lvl w:ilvl="7" w:tentative="1">
+      <w:start w:val="1"/>
+      <w:numFmt w:val="bullet"/>
+      <w:lvlText w:val=""/>
+      <w:lvlJc w:val="left"/>
+      <w:pPr>
+        <w:tabs>
+          <w:tab w:val="num" w:pos="5760"/>
+        </w:tabs>
+        <w:ind w:left="5760" w:hanging="360"/>
+      </w:pPr>
+      <w:rPr>
+        <w:rFonts w:ascii="Wingdings" w:hAnsi="Wingdings" w:hint="default"/>
+        <w:sz w:val="20"/>
+      </w:rPr>
+    </w:lvl>
+    <w:lvl w:ilvl="8" w:tentative="1">
+      <w:start w:val="1"/>
+      <w:numFmt w:val="bullet"/>
+      <w:lvlText w:val=""/>
+      <w:lvlJc w:val="left"/>
+      <w:pPr>
+        <w:tabs>
+          <w:tab w:val="num" w:pos="6480"/>
+        </w:tabs>
+        <w:ind w:left="6480" w:hanging="360"/>
+      </w:pPr>
+      <w:rPr>
+        <w:rFonts w:ascii="Wingdings" w:hAnsi="Wingdings" w:hint="default"/>
+        <w:sz w:val="20"/>
+      </w:rPr>
+    </w:lvl>
+  </w:abstractNum>
+  <w:abstractNum w:abstractNumId="5" w15:restartNumberingAfterBreak="0">
     <w:nsid w:val="2BFC2884"/>
     <w:multiLevelType w:val="multilevel"/>
     <w:tmpl w:val="12E089B6"/>
@@ -8098,7 +10110,7 @@
       </w:rPr>
     </w:lvl>
   </w:abstractNum>
-  <w:abstractNum w:abstractNumId="3" w15:restartNumberingAfterBreak="0">
+  <w:abstractNum w:abstractNumId="6" w15:restartNumberingAfterBreak="0">
     <w:nsid w:val="2D293CDA"/>
     <w:multiLevelType w:val="multilevel"/>
     <w:tmpl w:val="78362946"/>
@@ -8247,7 +10259,156 @@
       </w:rPr>
     </w:lvl>
   </w:abstractNum>
-  <w:abstractNum w:abstractNumId="4" w15:restartNumberingAfterBreak="0">
+  <w:abstractNum w:abstractNumId="7" w15:restartNumberingAfterBreak="0">
+    <w:nsid w:val="3007453C"/>
+    <w:multiLevelType w:val="multilevel"/>
+    <w:tmpl w:val="8102C4A4"/>
+    <w:lvl w:ilvl="0">
+      <w:start w:val="1"/>
+      <w:numFmt w:val="bullet"/>
+      <w:lvlText w:val=""/>
+      <w:lvlJc w:val="left"/>
+      <w:pPr>
+        <w:tabs>
+          <w:tab w:val="num" w:pos="720"/>
+        </w:tabs>
+        <w:ind w:left="720" w:hanging="360"/>
+      </w:pPr>
+      <w:rPr>
+        <w:rFonts w:ascii="Symbol" w:hAnsi="Symbol" w:hint="default"/>
+        <w:sz w:val="20"/>
+      </w:rPr>
+    </w:lvl>
+    <w:lvl w:ilvl="1" w:tentative="1">
+      <w:start w:val="1"/>
+      <w:numFmt w:val="bullet"/>
+      <w:lvlText w:val="o"/>
+      <w:lvlJc w:val="left"/>
+      <w:pPr>
+        <w:tabs>
+          <w:tab w:val="num" w:pos="1440"/>
+        </w:tabs>
+        <w:ind w:left="1440" w:hanging="360"/>
+      </w:pPr>
+      <w:rPr>
+        <w:rFonts w:ascii="Courier New" w:hAnsi="Courier New" w:hint="default"/>
+        <w:sz w:val="20"/>
+      </w:rPr>
+    </w:lvl>
+    <w:lvl w:ilvl="2" w:tentative="1">
+      <w:start w:val="1"/>
+      <w:numFmt w:val="bullet"/>
+      <w:lvlText w:val=""/>
+      <w:lvlJc w:val="left"/>
+      <w:pPr>
+        <w:tabs>
+          <w:tab w:val="num" w:pos="2160"/>
+        </w:tabs>
+        <w:ind w:left="2160" w:hanging="360"/>
+      </w:pPr>
+      <w:rPr>
+        <w:rFonts w:ascii="Wingdings" w:hAnsi="Wingdings" w:hint="default"/>
+        <w:sz w:val="20"/>
+      </w:rPr>
+    </w:lvl>
+    <w:lvl w:ilvl="3" w:tentative="1">
+      <w:start w:val="1"/>
+      <w:numFmt w:val="bullet"/>
+      <w:lvlText w:val=""/>
+      <w:lvlJc w:val="left"/>
+      <w:pPr>
+        <w:tabs>
+          <w:tab w:val="num" w:pos="2880"/>
+        </w:tabs>
+        <w:ind w:left="2880" w:hanging="360"/>
+      </w:pPr>
+      <w:rPr>
+        <w:rFonts w:ascii="Wingdings" w:hAnsi="Wingdings" w:hint="default"/>
+        <w:sz w:val="20"/>
+      </w:rPr>
+    </w:lvl>
+    <w:lvl w:ilvl="4" w:tentative="1">
+      <w:start w:val="1"/>
+      <w:numFmt w:val="bullet"/>
+      <w:lvlText w:val=""/>
+      <w:lvlJc w:val="left"/>
+      <w:pPr>
+        <w:tabs>
+          <w:tab w:val="num" w:pos="3600"/>
+        </w:tabs>
+        <w:ind w:left="3600" w:hanging="360"/>
+      </w:pPr>
+      <w:rPr>
+        <w:rFonts w:ascii="Wingdings" w:hAnsi="Wingdings" w:hint="default"/>
+        <w:sz w:val="20"/>
+      </w:rPr>
+    </w:lvl>
+    <w:lvl w:ilvl="5" w:tentative="1">
+      <w:start w:val="1"/>
+      <w:numFmt w:val="bullet"/>
+      <w:lvlText w:val=""/>
+      <w:lvlJc w:val="left"/>
+      <w:pPr>
+        <w:tabs>
+          <w:tab w:val="num" w:pos="4320"/>
+        </w:tabs>
+        <w:ind w:left="4320" w:hanging="360"/>
+      </w:pPr>
+      <w:rPr>
+        <w:rFonts w:ascii="Wingdings" w:hAnsi="Wingdings" w:hint="default"/>
+        <w:sz w:val="20"/>
+      </w:rPr>
+    </w:lvl>
+    <w:lvl w:ilvl="6" w:tentative="1">
+      <w:start w:val="1"/>
+      <w:numFmt w:val="bullet"/>
+      <w:lvlText w:val=""/>
+      <w:lvlJc w:val="left"/>
+      <w:pPr>
+        <w:tabs>
+          <w:tab w:val="num" w:pos="5040"/>
+        </w:tabs>
+        <w:ind w:left="5040" w:hanging="360"/>
+      </w:pPr>
+      <w:rPr>
+        <w:rFonts w:ascii="Wingdings" w:hAnsi="Wingdings" w:hint="default"/>
+        <w:sz w:val="20"/>
+      </w:rPr>
+    </w:lvl>
+    <w:lvl w:ilvl="7" w:tentative="1">
+      <w:start w:val="1"/>
+      <w:numFmt w:val="bullet"/>
+      <w:lvlText w:val=""/>
+      <w:lvlJc w:val="left"/>
+      <w:pPr>
+        <w:tabs>
+          <w:tab w:val="num" w:pos="5760"/>
+        </w:tabs>
+        <w:ind w:left="5760" w:hanging="360"/>
+      </w:pPr>
+      <w:rPr>
+        <w:rFonts w:ascii="Wingdings" w:hAnsi="Wingdings" w:hint="default"/>
+        <w:sz w:val="20"/>
+      </w:rPr>
+    </w:lvl>
+    <w:lvl w:ilvl="8" w:tentative="1">
+      <w:start w:val="1"/>
+      <w:numFmt w:val="bullet"/>
+      <w:lvlText w:val=""/>
+      <w:lvlJc w:val="left"/>
+      <w:pPr>
+        <w:tabs>
+          <w:tab w:val="num" w:pos="6480"/>
+        </w:tabs>
+        <w:ind w:left="6480" w:hanging="360"/>
+      </w:pPr>
+      <w:rPr>
+        <w:rFonts w:ascii="Wingdings" w:hAnsi="Wingdings" w:hint="default"/>
+        <w:sz w:val="20"/>
+      </w:rPr>
+    </w:lvl>
+  </w:abstractNum>
+  <w:abstractNum w:abstractNumId="8" w15:restartNumberingAfterBreak="0">
     <w:nsid w:val="307704BE"/>
     <w:multiLevelType w:val="multilevel"/>
     <w:tmpl w:val="577CCB3C"/>
@@ -8396,7 +10557,156 @@
       </w:rPr>
     </w:lvl>
   </w:abstractNum>
-  <w:abstractNum w:abstractNumId="5" w15:restartNumberingAfterBreak="0">
+  <w:abstractNum w:abstractNumId="9" w15:restartNumberingAfterBreak="0">
+    <w:nsid w:val="365930D3"/>
+    <w:multiLevelType w:val="multilevel"/>
+    <w:tmpl w:val="BA303748"/>
+    <w:lvl w:ilvl="0">
+      <w:start w:val="1"/>
+      <w:numFmt w:val="bullet"/>
+      <w:lvlText w:val=""/>
+      <w:lvlJc w:val="left"/>
+      <w:pPr>
+        <w:tabs>
+          <w:tab w:val="num" w:pos="720"/>
+        </w:tabs>
+        <w:ind w:left="720" w:hanging="360"/>
+      </w:pPr>
+      <w:rPr>
+        <w:rFonts w:ascii="Symbol" w:hAnsi="Symbol" w:hint="default"/>
+        <w:sz w:val="20"/>
+      </w:rPr>
+    </w:lvl>
+    <w:lvl w:ilvl="1" w:tentative="1">
+      <w:start w:val="1"/>
+      <w:numFmt w:val="bullet"/>
+      <w:lvlText w:val="o"/>
+      <w:lvlJc w:val="left"/>
+      <w:pPr>
+        <w:tabs>
+          <w:tab w:val="num" w:pos="1440"/>
+        </w:tabs>
+        <w:ind w:left="1440" w:hanging="360"/>
+      </w:pPr>
+      <w:rPr>
+        <w:rFonts w:ascii="Courier New" w:hAnsi="Courier New" w:hint="default"/>
+        <w:sz w:val="20"/>
+      </w:rPr>
+    </w:lvl>
+    <w:lvl w:ilvl="2" w:tentative="1">
+      <w:start w:val="1"/>
+      <w:numFmt w:val="bullet"/>
+      <w:lvlText w:val=""/>
+      <w:lvlJc w:val="left"/>
+      <w:pPr>
+        <w:tabs>
+          <w:tab w:val="num" w:pos="2160"/>
+        </w:tabs>
+        <w:ind w:left="2160" w:hanging="360"/>
+      </w:pPr>
+      <w:rPr>
+        <w:rFonts w:ascii="Wingdings" w:hAnsi="Wingdings" w:hint="default"/>
+        <w:sz w:val="20"/>
+      </w:rPr>
+    </w:lvl>
+    <w:lvl w:ilvl="3" w:tentative="1">
+      <w:start w:val="1"/>
+      <w:numFmt w:val="bullet"/>
+      <w:lvlText w:val=""/>
+      <w:lvlJc w:val="left"/>
+      <w:pPr>
+        <w:tabs>
+          <w:tab w:val="num" w:pos="2880"/>
+        </w:tabs>
+        <w:ind w:left="2880" w:hanging="360"/>
+      </w:pPr>
+      <w:rPr>
+        <w:rFonts w:ascii="Wingdings" w:hAnsi="Wingdings" w:hint="default"/>
+        <w:sz w:val="20"/>
+      </w:rPr>
+    </w:lvl>
+    <w:lvl w:ilvl="4" w:tentative="1">
+      <w:start w:val="1"/>
+      <w:numFmt w:val="bullet"/>
+      <w:lvlText w:val=""/>
+      <w:lvlJc w:val="left"/>
+      <w:pPr>
+        <w:tabs>
+          <w:tab w:val="num" w:pos="3600"/>
+        </w:tabs>
+        <w:ind w:left="3600" w:hanging="360"/>
+      </w:pPr>
+      <w:rPr>
+        <w:rFonts w:ascii="Wingdings" w:hAnsi="Wingdings" w:hint="default"/>
+        <w:sz w:val="20"/>
+      </w:rPr>
+    </w:lvl>
+    <w:lvl w:ilvl="5" w:tentative="1">
+      <w:start w:val="1"/>
+      <w:numFmt w:val="bullet"/>
+      <w:lvlText w:val=""/>
+      <w:lvlJc w:val="left"/>
+      <w:pPr>
+        <w:tabs>
+          <w:tab w:val="num" w:pos="4320"/>
+        </w:tabs>
+        <w:ind w:left="4320" w:hanging="360"/>
+      </w:pPr>
+      <w:rPr>
+        <w:rFonts w:ascii="Wingdings" w:hAnsi="Wingdings" w:hint="default"/>
+        <w:sz w:val="20"/>
+      </w:rPr>
+    </w:lvl>
+    <w:lvl w:ilvl="6" w:tentative="1">
+      <w:start w:val="1"/>
+      <w:numFmt w:val="bullet"/>
+      <w:lvlText w:val=""/>
+      <w:lvlJc w:val="left"/>
+      <w:pPr>
+        <w:tabs>
+          <w:tab w:val="num" w:pos="5040"/>
+        </w:tabs>
+        <w:ind w:left="5040" w:hanging="360"/>
+      </w:pPr>
+      <w:rPr>
+        <w:rFonts w:ascii="Wingdings" w:hAnsi="Wingdings" w:hint="default"/>
+        <w:sz w:val="20"/>
+      </w:rPr>
+    </w:lvl>
+    <w:lvl w:ilvl="7" w:tentative="1">
+      <w:start w:val="1"/>
+      <w:numFmt w:val="bullet"/>
+      <w:lvlText w:val=""/>
+      <w:lvlJc w:val="left"/>
+      <w:pPr>
+        <w:tabs>
+          <w:tab w:val="num" w:pos="5760"/>
+        </w:tabs>
+        <w:ind w:left="5760" w:hanging="360"/>
+      </w:pPr>
+      <w:rPr>
+        <w:rFonts w:ascii="Wingdings" w:hAnsi="Wingdings" w:hint="default"/>
+        <w:sz w:val="20"/>
+      </w:rPr>
+    </w:lvl>
+    <w:lvl w:ilvl="8" w:tentative="1">
+      <w:start w:val="1"/>
+      <w:numFmt w:val="bullet"/>
+      <w:lvlText w:val=""/>
+      <w:lvlJc w:val="left"/>
+      <w:pPr>
+        <w:tabs>
+          <w:tab w:val="num" w:pos="6480"/>
+        </w:tabs>
+        <w:ind w:left="6480" w:hanging="360"/>
+      </w:pPr>
+      <w:rPr>
+        <w:rFonts w:ascii="Wingdings" w:hAnsi="Wingdings" w:hint="default"/>
+        <w:sz w:val="20"/>
+      </w:rPr>
+    </w:lvl>
+  </w:abstractNum>
+  <w:abstractNum w:abstractNumId="10" w15:restartNumberingAfterBreak="0">
     <w:nsid w:val="38C34353"/>
     <w:multiLevelType w:val="multilevel"/>
     <w:tmpl w:val="FE0CADBE"/>
@@ -8545,7 +10855,7 @@
       </w:rPr>
     </w:lvl>
   </w:abstractNum>
-  <w:abstractNum w:abstractNumId="6" w15:restartNumberingAfterBreak="0">
+  <w:abstractNum w:abstractNumId="11" w15:restartNumberingAfterBreak="0">
     <w:nsid w:val="3D1E7757"/>
     <w:multiLevelType w:val="multilevel"/>
     <w:tmpl w:val="24566A08"/>
@@ -8694,7 +11004,7 @@
       </w:rPr>
     </w:lvl>
   </w:abstractNum>
-  <w:abstractNum w:abstractNumId="7" w15:restartNumberingAfterBreak="0">
+  <w:abstractNum w:abstractNumId="12" w15:restartNumberingAfterBreak="0">
     <w:nsid w:val="3F1A1771"/>
     <w:multiLevelType w:val="hybridMultilevel"/>
     <w:tmpl w:val="A54CFE9A"/>
@@ -8783,7 +11093,7 @@
       </w:pPr>
     </w:lvl>
   </w:abstractNum>
-  <w:abstractNum w:abstractNumId="8" w15:restartNumberingAfterBreak="0">
+  <w:abstractNum w:abstractNumId="13" w15:restartNumberingAfterBreak="0">
     <w:nsid w:val="5BCA0F50"/>
     <w:multiLevelType w:val="multilevel"/>
     <w:tmpl w:val="5EC8ABAA"/>
@@ -8932,32 +11242,315 @@
       </w:rPr>
     </w:lvl>
   </w:abstractNum>
+  <w:abstractNum w:abstractNumId="14" w15:restartNumberingAfterBreak="0">
+    <w:nsid w:val="71B90EAF"/>
+    <w:multiLevelType w:val="multilevel"/>
+    <w:tmpl w:val="0A4C4AAA"/>
+    <w:lvl w:ilvl="0">
+      <w:start w:val="1"/>
+      <w:numFmt w:val="decimal"/>
+      <w:lvlText w:val="%1."/>
+      <w:lvlJc w:val="left"/>
+      <w:pPr>
+        <w:tabs>
+          <w:tab w:val="num" w:pos="720"/>
+        </w:tabs>
+        <w:ind w:left="720" w:hanging="360"/>
+      </w:pPr>
+    </w:lvl>
+    <w:lvl w:ilvl="1" w:tentative="1">
+      <w:start w:val="1"/>
+      <w:numFmt w:val="decimal"/>
+      <w:lvlText w:val="%2."/>
+      <w:lvlJc w:val="left"/>
+      <w:pPr>
+        <w:tabs>
+          <w:tab w:val="num" w:pos="1440"/>
+        </w:tabs>
+        <w:ind w:left="1440" w:hanging="360"/>
+      </w:pPr>
+    </w:lvl>
+    <w:lvl w:ilvl="2" w:tentative="1">
+      <w:start w:val="1"/>
+      <w:numFmt w:val="decimal"/>
+      <w:lvlText w:val="%3."/>
+      <w:lvlJc w:val="left"/>
+      <w:pPr>
+        <w:tabs>
+          <w:tab w:val="num" w:pos="2160"/>
+        </w:tabs>
+        <w:ind w:left="2160" w:hanging="360"/>
+      </w:pPr>
+    </w:lvl>
+    <w:lvl w:ilvl="3" w:tentative="1">
+      <w:start w:val="1"/>
+      <w:numFmt w:val="decimal"/>
+      <w:lvlText w:val="%4."/>
+      <w:lvlJc w:val="left"/>
+      <w:pPr>
+        <w:tabs>
+          <w:tab w:val="num" w:pos="2880"/>
+        </w:tabs>
+        <w:ind w:left="2880" w:hanging="360"/>
+      </w:pPr>
+    </w:lvl>
+    <w:lvl w:ilvl="4" w:tentative="1">
+      <w:start w:val="1"/>
+      <w:numFmt w:val="decimal"/>
+      <w:lvlText w:val="%5."/>
+      <w:lvlJc w:val="left"/>
+      <w:pPr>
+        <w:tabs>
+          <w:tab w:val="num" w:pos="3600"/>
+        </w:tabs>
+        <w:ind w:left="3600" w:hanging="360"/>
+      </w:pPr>
+    </w:lvl>
+    <w:lvl w:ilvl="5" w:tentative="1">
+      <w:start w:val="1"/>
+      <w:numFmt w:val="decimal"/>
+      <w:lvlText w:val="%6."/>
+      <w:lvlJc w:val="left"/>
+      <w:pPr>
+        <w:tabs>
+          <w:tab w:val="num" w:pos="4320"/>
+        </w:tabs>
+        <w:ind w:left="4320" w:hanging="360"/>
+      </w:pPr>
+    </w:lvl>
+    <w:lvl w:ilvl="6" w:tentative="1">
+      <w:start w:val="1"/>
+      <w:numFmt w:val="decimal"/>
+      <w:lvlText w:val="%7."/>
+      <w:lvlJc w:val="left"/>
+      <w:pPr>
+        <w:tabs>
+          <w:tab w:val="num" w:pos="5040"/>
+        </w:tabs>
+        <w:ind w:left="5040" w:hanging="360"/>
+      </w:pPr>
+    </w:lvl>
+    <w:lvl w:ilvl="7" w:tentative="1">
+      <w:start w:val="1"/>
+      <w:numFmt w:val="decimal"/>
+      <w:lvlText w:val="%8."/>
+      <w:lvlJc w:val="left"/>
+      <w:pPr>
+        <w:tabs>
+          <w:tab w:val="num" w:pos="5760"/>
+        </w:tabs>
+        <w:ind w:left="5760" w:hanging="360"/>
+      </w:pPr>
+    </w:lvl>
+    <w:lvl w:ilvl="8" w:tentative="1">
+      <w:start w:val="1"/>
+      <w:numFmt w:val="decimal"/>
+      <w:lvlText w:val="%9."/>
+      <w:lvlJc w:val="left"/>
+      <w:pPr>
+        <w:tabs>
+          <w:tab w:val="num" w:pos="6480"/>
+        </w:tabs>
+        <w:ind w:left="6480" w:hanging="360"/>
+      </w:pPr>
+    </w:lvl>
+  </w:abstractNum>
+  <w:abstractNum w:abstractNumId="15" w15:restartNumberingAfterBreak="0">
+    <w:nsid w:val="75F63038"/>
+    <w:multiLevelType w:val="multilevel"/>
+    <w:tmpl w:val="0532AC74"/>
+    <w:lvl w:ilvl="0">
+      <w:start w:val="1"/>
+      <w:numFmt w:val="bullet"/>
+      <w:lvlText w:val=""/>
+      <w:lvlJc w:val="left"/>
+      <w:pPr>
+        <w:tabs>
+          <w:tab w:val="num" w:pos="720"/>
+        </w:tabs>
+        <w:ind w:left="720" w:hanging="360"/>
+      </w:pPr>
+      <w:rPr>
+        <w:rFonts w:ascii="Symbol" w:hAnsi="Symbol" w:hint="default"/>
+        <w:sz w:val="20"/>
+      </w:rPr>
+    </w:lvl>
+    <w:lvl w:ilvl="1" w:tentative="1">
+      <w:start w:val="1"/>
+      <w:numFmt w:val="bullet"/>
+      <w:lvlText w:val="o"/>
+      <w:lvlJc w:val="left"/>
+      <w:pPr>
+        <w:tabs>
+          <w:tab w:val="num" w:pos="1440"/>
+        </w:tabs>
+        <w:ind w:left="1440" w:hanging="360"/>
+      </w:pPr>
+      <w:rPr>
+        <w:rFonts w:ascii="Courier New" w:hAnsi="Courier New" w:hint="default"/>
+        <w:sz w:val="20"/>
+      </w:rPr>
+    </w:lvl>
+    <w:lvl w:ilvl="2" w:tentative="1">
+      <w:start w:val="1"/>
+      <w:numFmt w:val="bullet"/>
+      <w:lvlText w:val=""/>
+      <w:lvlJc w:val="left"/>
+      <w:pPr>
+        <w:tabs>
+          <w:tab w:val="num" w:pos="2160"/>
+        </w:tabs>
+        <w:ind w:left="2160" w:hanging="360"/>
+      </w:pPr>
+      <w:rPr>
+        <w:rFonts w:ascii="Wingdings" w:hAnsi="Wingdings" w:hint="default"/>
+        <w:sz w:val="20"/>
+      </w:rPr>
+    </w:lvl>
+    <w:lvl w:ilvl="3" w:tentative="1">
+      <w:start w:val="1"/>
+      <w:numFmt w:val="bullet"/>
+      <w:lvlText w:val=""/>
+      <w:lvlJc w:val="left"/>
+      <w:pPr>
+        <w:tabs>
+          <w:tab w:val="num" w:pos="2880"/>
+        </w:tabs>
+        <w:ind w:left="2880" w:hanging="360"/>
+      </w:pPr>
+      <w:rPr>
+        <w:rFonts w:ascii="Wingdings" w:hAnsi="Wingdings" w:hint="default"/>
+        <w:sz w:val="20"/>
+      </w:rPr>
+    </w:lvl>
+    <w:lvl w:ilvl="4" w:tentative="1">
+      <w:start w:val="1"/>
+      <w:numFmt w:val="bullet"/>
+      <w:lvlText w:val=""/>
+      <w:lvlJc w:val="left"/>
+      <w:pPr>
+        <w:tabs>
+          <w:tab w:val="num" w:pos="3600"/>
+        </w:tabs>
+        <w:ind w:left="3600" w:hanging="360"/>
+      </w:pPr>
+      <w:rPr>
+        <w:rFonts w:ascii="Wingdings" w:hAnsi="Wingdings" w:hint="default"/>
+        <w:sz w:val="20"/>
+      </w:rPr>
+    </w:lvl>
+    <w:lvl w:ilvl="5" w:tentative="1">
+      <w:start w:val="1"/>
+      <w:numFmt w:val="bullet"/>
+      <w:lvlText w:val=""/>
+      <w:lvlJc w:val="left"/>
+      <w:pPr>
+        <w:tabs>
+          <w:tab w:val="num" w:pos="4320"/>
+        </w:tabs>
+        <w:ind w:left="4320" w:hanging="360"/>
+      </w:pPr>
+      <w:rPr>
+        <w:rFonts w:ascii="Wingdings" w:hAnsi="Wingdings" w:hint="default"/>
+        <w:sz w:val="20"/>
+      </w:rPr>
+    </w:lvl>
+    <w:lvl w:ilvl="6" w:tentative="1">
+      <w:start w:val="1"/>
+      <w:numFmt w:val="bullet"/>
+      <w:lvlText w:val=""/>
+      <w:lvlJc w:val="left"/>
+      <w:pPr>
+        <w:tabs>
+          <w:tab w:val="num" w:pos="5040"/>
+        </w:tabs>
+        <w:ind w:left="5040" w:hanging="360"/>
+      </w:pPr>
+      <w:rPr>
+        <w:rFonts w:ascii="Wingdings" w:hAnsi="Wingdings" w:hint="default"/>
+        <w:sz w:val="20"/>
+      </w:rPr>
+    </w:lvl>
+    <w:lvl w:ilvl="7" w:tentative="1">
+      <w:start w:val="1"/>
+      <w:numFmt w:val="bullet"/>
+      <w:lvlText w:val=""/>
+      <w:lvlJc w:val="left"/>
+      <w:pPr>
+        <w:tabs>
+          <w:tab w:val="num" w:pos="5760"/>
+        </w:tabs>
+        <w:ind w:left="5760" w:hanging="360"/>
+      </w:pPr>
+      <w:rPr>
+        <w:rFonts w:ascii="Wingdings" w:hAnsi="Wingdings" w:hint="default"/>
+        <w:sz w:val="20"/>
+      </w:rPr>
+    </w:lvl>
+    <w:lvl w:ilvl="8" w:tentative="1">
+      <w:start w:val="1"/>
+      <w:numFmt w:val="bullet"/>
+      <w:lvlText w:val=""/>
+      <w:lvlJc w:val="left"/>
+      <w:pPr>
+        <w:tabs>
+          <w:tab w:val="num" w:pos="6480"/>
+        </w:tabs>
+        <w:ind w:left="6480" w:hanging="360"/>
+      </w:pPr>
+      <w:rPr>
+        <w:rFonts w:ascii="Wingdings" w:hAnsi="Wingdings" w:hint="default"/>
+        <w:sz w:val="20"/>
+      </w:rPr>
+    </w:lvl>
+  </w:abstractNum>
   <w:num w:numId="1">
+    <w:abstractNumId w:val="12"/>
+  </w:num>
+  <w:num w:numId="2">
+    <w:abstractNumId w:val="13"/>
+  </w:num>
+  <w:num w:numId="3">
+    <w:abstractNumId w:val="1"/>
+  </w:num>
+  <w:num w:numId="4">
+    <w:abstractNumId w:val="6"/>
+  </w:num>
+  <w:num w:numId="5">
+    <w:abstractNumId w:val="8"/>
+  </w:num>
+  <w:num w:numId="6">
+    <w:abstractNumId w:val="10"/>
+  </w:num>
+  <w:num w:numId="7">
+    <w:abstractNumId w:val="3"/>
+  </w:num>
+  <w:num w:numId="8">
+    <w:abstractNumId w:val="5"/>
+  </w:num>
+  <w:num w:numId="9">
+    <w:abstractNumId w:val="11"/>
+  </w:num>
+  <w:num w:numId="10">
+    <w:abstractNumId w:val="0"/>
+  </w:num>
+  <w:num w:numId="11">
+    <w:abstractNumId w:val="4"/>
+  </w:num>
+  <w:num w:numId="12">
+    <w:abstractNumId w:val="2"/>
+  </w:num>
+  <w:num w:numId="13">
+    <w:abstractNumId w:val="14"/>
+  </w:num>
+  <w:num w:numId="14">
+    <w:abstractNumId w:val="15"/>
+  </w:num>
+  <w:num w:numId="15">
     <w:abstractNumId w:val="7"/>
   </w:num>
-  <w:num w:numId="2">
-    <w:abstractNumId w:val="8"/>
-  </w:num>
-  <w:num w:numId="3">
-    <w:abstractNumId w:val="0"/>
-  </w:num>
-  <w:num w:numId="4">
-    <w:abstractNumId w:val="3"/>
-  </w:num>
-  <w:num w:numId="5">
-    <w:abstractNumId w:val="4"/>
-  </w:num>
-  <w:num w:numId="6">
-    <w:abstractNumId w:val="5"/>
-  </w:num>
-  <w:num w:numId="7">
-    <w:abstractNumId w:val="1"/>
-  </w:num>
-  <w:num w:numId="8">
-    <w:abstractNumId w:val="2"/>
-  </w:num>
-  <w:num w:numId="9">
-    <w:abstractNumId w:val="6"/>
+  <w:num w:numId="16">
+    <w:abstractNumId w:val="9"/>
   </w:num>
 </w:numbering>
 </file>
@@ -9410,7 +12003,6 @@
     <w:next w:val="Normal"/>
     <w:link w:val="Heading3Char"/>
     <w:uiPriority w:val="9"/>
-    <w:semiHidden/>
     <w:unhideWhenUsed/>
     <w:qFormat/>
     <w:rsid w:val="00E915F0"/>
@@ -9496,7 +12088,6 @@
     <w:basedOn w:val="DefaultParagraphFont"/>
     <w:link w:val="Heading3"/>
     <w:uiPriority w:val="9"/>
-    <w:semiHidden/>
     <w:rsid w:val="00E915F0"/>
     <w:rPr>
       <w:rFonts w:asciiTheme="majorHAnsi" w:eastAsiaTheme="majorEastAsia" w:hAnsiTheme="majorHAnsi" w:cstheme="majorBidi"/>
@@ -9593,6 +12184,38 @@
       <w:rFonts w:ascii="Courier New" w:eastAsia="Times New Roman" w:hAnsi="Courier New" w:cs="Courier New"/>
       <w:sz w:val="20"/>
       <w:szCs w:val="20"/>
+    </w:rPr>
+  </w:style>
+  <w:style w:type="character" w:customStyle="1" w:styleId="whitespace-normal">
+    <w:name w:val="whitespace-normal"/>
+    <w:basedOn w:val="DefaultParagraphFont"/>
+    <w:rsid w:val="00241807"/>
+  </w:style>
+  <w:style w:type="character" w:customStyle="1" w:styleId="d">
+    <w:name w:val="ͼd"/>
+    <w:basedOn w:val="DefaultParagraphFont"/>
+    <w:rsid w:val="00241807"/>
+  </w:style>
+  <w:style w:type="character" w:customStyle="1" w:styleId="f">
+    <w:name w:val="ͼf"/>
+    <w:basedOn w:val="DefaultParagraphFont"/>
+    <w:rsid w:val="00241807"/>
+  </w:style>
+  <w:style w:type="character" w:customStyle="1" w:styleId="c">
+    <w:name w:val="ͼc"/>
+    <w:basedOn w:val="DefaultParagraphFont"/>
+    <w:rsid w:val="00241807"/>
+  </w:style>
+  <w:style w:type="character" w:styleId="Hyperlink">
+    <w:name w:val="Hyperlink"/>
+    <w:basedOn w:val="DefaultParagraphFont"/>
+    <w:uiPriority w:val="99"/>
+    <w:semiHidden/>
+    <w:unhideWhenUsed/>
+    <w:rsid w:val="00D143E2"/>
+    <w:rPr>
+      <w:color w:val="0000FF"/>
+      <w:u w:val="single"/>
     </w:rPr>
   </w:style>
 </w:styles>

</xml_diff>